<commit_message>
Mathcad lab 5 done
</commit_message>
<xml_diff>
--- a/mathcad/Лабораторная-работа-5/ПРИ123-ММГО-#05-Нямаа.docx
+++ b/mathcad/Лабораторная-работа-5/ПРИ123-ММГО-#05-Нямаа.docx
@@ -1036,15 +1036,100 @@
           <w:sz w:val="28"/>
           <w:szCs w:val="28"/>
         </w:rPr>
-        <w:t xml:space="preserve"> В ходе выполнения данного примера была построена прямая</w:t>
-      </w:r>
-      <w:r>
-        <w:rPr>
-          <w:sz w:val="28"/>
-          <w:szCs w:val="28"/>
-        </w:rPr>
-        <w:t>, заданная двумя точками, в пространстве.</w:t>
-      </w:r>
+        <w:t xml:space="preserve"> В ходе выполнения данного примера была построена </w:t>
+      </w:r>
+      <w:r>
+        <w:rPr>
+          <w:sz w:val="28"/>
+          <w:szCs w:val="28"/>
+        </w:rPr>
+        <w:t>гипербола с использованием непараметрического представления.</w:t>
+      </w:r>
+    </w:p>
+    <w:p>
+      <w:pPr>
+        <w:spacing w:line="360" w:lineRule="auto"/>
+        <w:jc w:val="center"/>
+        <w:rPr>
+          <w:sz w:val="28"/>
+          <w:szCs w:val="28"/>
+        </w:rPr>
+      </w:pPr>
+      <w:r>
+        <w:rPr>
+          <w:sz w:val="28"/>
+          <w:szCs w:val="28"/>
+        </w:rPr>
+        <w:drawing>
+          <wp:inline distT="0" distB="0" distL="0" distR="0" wp14:anchorId="024103A6" wp14:editId="4C28DE81">
+            <wp:extent cx="3497580" cy="4257663"/>
+            <wp:effectExtent l="0" t="0" r="0" b="0"/>
+            <wp:docPr id="1" name="Рисунок 1"/>
+            <wp:cNvGraphicFramePr>
+              <a:graphicFrameLocks xmlns:a="http://schemas.openxmlformats.org/drawingml/2006/main" noChangeAspect="1"/>
+            </wp:cNvGraphicFramePr>
+            <a:graphic xmlns:a="http://schemas.openxmlformats.org/drawingml/2006/main">
+              <a:graphicData uri="http://schemas.openxmlformats.org/drawingml/2006/picture">
+                <pic:pic xmlns:pic="http://schemas.openxmlformats.org/drawingml/2006/picture">
+                  <pic:nvPicPr>
+                    <pic:cNvPr id="1" name=""/>
+                    <pic:cNvPicPr/>
+                  </pic:nvPicPr>
+                  <pic:blipFill rotWithShape="1">
+                    <a:blip r:embed="rId6"/>
+                    <a:srcRect t="628"/>
+                    <a:stretch/>
+                  </pic:blipFill>
+                  <pic:spPr bwMode="auto">
+                    <a:xfrm>
+                      <a:off x="0" y="0"/>
+                      <a:ext cx="3515515" cy="4279495"/>
+                    </a:xfrm>
+                    <a:prstGeom prst="rect">
+                      <a:avLst/>
+                    </a:prstGeom>
+                    <a:ln>
+                      <a:noFill/>
+                    </a:ln>
+                    <a:extLst>
+                      <a:ext uri="{53640926-AAD7-44D8-BBD7-CCE9431645EC}">
+                        <a14:shadowObscured xmlns:a14="http://schemas.microsoft.com/office/drawing/2010/main"/>
+                      </a:ext>
+                    </a:extLst>
+                  </pic:spPr>
+                </pic:pic>
+              </a:graphicData>
+            </a:graphic>
+          </wp:inline>
+        </w:drawing>
+      </w:r>
+    </w:p>
+    <w:p>
+      <w:pPr>
+        <w:spacing w:line="360" w:lineRule="auto"/>
+        <w:jc w:val="center"/>
+        <w:rPr>
+          <w:sz w:val="28"/>
+          <w:szCs w:val="28"/>
+        </w:rPr>
+      </w:pPr>
+      <w:r>
+        <w:rPr>
+          <w:sz w:val="28"/>
+          <w:szCs w:val="28"/>
+        </w:rPr>
+        <w:t>Рисунок 1. Выполнение примера 5.3.</w:t>
+      </w:r>
+    </w:p>
+    <w:p>
+      <w:pPr>
+        <w:spacing w:line="360" w:lineRule="auto"/>
+        <w:jc w:val="center"/>
+        <w:rPr>
+          <w:sz w:val="28"/>
+          <w:szCs w:val="28"/>
+        </w:rPr>
+      </w:pPr>
     </w:p>
     <w:p>
       <w:pPr>
@@ -1072,7 +1157,7 @@
           <w:sz w:val="28"/>
           <w:szCs w:val="28"/>
         </w:rPr>
-        <w:t xml:space="preserve"> 5.</w:t>
+        <w:t xml:space="preserve"> 5.4</w:t>
       </w:r>
       <w:r>
         <w:rPr>
@@ -1081,8 +1166,159 @@
           <w:sz w:val="28"/>
           <w:szCs w:val="28"/>
         </w:rPr>
-        <w:t>4</w:t>
-      </w:r>
+        <w:t>.</w:t>
+      </w:r>
+      <w:r>
+        <w:rPr>
+          <w:sz w:val="28"/>
+          <w:szCs w:val="28"/>
+        </w:rPr>
+        <w:t xml:space="preserve"> В ходе выполнения данного примера была построена </w:t>
+      </w:r>
+      <w:r>
+        <w:rPr>
+          <w:sz w:val="28"/>
+          <w:szCs w:val="28"/>
+        </w:rPr>
+        <w:t>парабола с использованием непараметрического представления.</w:t>
+      </w:r>
+    </w:p>
+    <w:p>
+      <w:pPr>
+        <w:pStyle w:val="a8"/>
+        <w:spacing w:line="360" w:lineRule="auto"/>
+        <w:jc w:val="center"/>
+        <w:rPr>
+          <w:rFonts w:ascii="Times New Roman" w:hAnsi="Times New Roman"/>
+          <w:sz w:val="28"/>
+          <w:szCs w:val="28"/>
+          <w:lang w:val="ru-RU"/>
+        </w:rPr>
+      </w:pPr>
+      <w:r>
+        <w:rPr>
+          <w:rFonts w:ascii="Times New Roman" w:hAnsi="Times New Roman"/>
+          <w:sz w:val="28"/>
+          <w:szCs w:val="28"/>
+          <w:lang w:val="ru-RU"/>
+        </w:rPr>
+        <w:lastRenderedPageBreak/>
+        <w:drawing>
+          <wp:inline distT="0" distB="0" distL="0" distR="0" wp14:anchorId="63E88C32" wp14:editId="6472D357">
+            <wp:extent cx="3192097" cy="3825240"/>
+            <wp:effectExtent l="0" t="0" r="0" b="0"/>
+            <wp:docPr id="2" name="Рисунок 2"/>
+            <wp:cNvGraphicFramePr>
+              <a:graphicFrameLocks xmlns:a="http://schemas.openxmlformats.org/drawingml/2006/main" noChangeAspect="1"/>
+            </wp:cNvGraphicFramePr>
+            <a:graphic xmlns:a="http://schemas.openxmlformats.org/drawingml/2006/main">
+              <a:graphicData uri="http://schemas.openxmlformats.org/drawingml/2006/picture">
+                <pic:pic xmlns:pic="http://schemas.openxmlformats.org/drawingml/2006/picture">
+                  <pic:nvPicPr>
+                    <pic:cNvPr id="1" name=""/>
+                    <pic:cNvPicPr/>
+                  </pic:nvPicPr>
+                  <pic:blipFill>
+                    <a:blip r:embed="rId7"/>
+                    <a:stretch>
+                      <a:fillRect/>
+                    </a:stretch>
+                  </pic:blipFill>
+                  <pic:spPr>
+                    <a:xfrm>
+                      <a:off x="0" y="0"/>
+                      <a:ext cx="3213152" cy="3850471"/>
+                    </a:xfrm>
+                    <a:prstGeom prst="rect">
+                      <a:avLst/>
+                    </a:prstGeom>
+                  </pic:spPr>
+                </pic:pic>
+              </a:graphicData>
+            </a:graphic>
+          </wp:inline>
+        </w:drawing>
+      </w:r>
+    </w:p>
+    <w:p>
+      <w:pPr>
+        <w:spacing w:line="360" w:lineRule="auto"/>
+        <w:jc w:val="center"/>
+        <w:rPr>
+          <w:sz w:val="28"/>
+          <w:szCs w:val="28"/>
+        </w:rPr>
+      </w:pPr>
+      <w:r>
+        <w:rPr>
+          <w:sz w:val="28"/>
+          <w:szCs w:val="28"/>
+        </w:rPr>
+        <w:t xml:space="preserve">Рисунок </w:t>
+      </w:r>
+      <w:r>
+        <w:rPr>
+          <w:sz w:val="28"/>
+          <w:szCs w:val="28"/>
+        </w:rPr>
+        <w:t>2</w:t>
+      </w:r>
+      <w:r>
+        <w:rPr>
+          <w:sz w:val="28"/>
+          <w:szCs w:val="28"/>
+        </w:rPr>
+        <w:t>. Выполнение пример</w:t>
+      </w:r>
+      <w:r>
+        <w:rPr>
+          <w:sz w:val="28"/>
+          <w:szCs w:val="28"/>
+        </w:rPr>
+        <w:t>а</w:t>
+      </w:r>
+      <w:r>
+        <w:rPr>
+          <w:sz w:val="28"/>
+          <w:szCs w:val="28"/>
+        </w:rPr>
+        <w:t xml:space="preserve"> </w:t>
+      </w:r>
+      <w:r>
+        <w:rPr>
+          <w:sz w:val="28"/>
+          <w:szCs w:val="28"/>
+        </w:rPr>
+        <w:t>5.4</w:t>
+      </w:r>
+      <w:r>
+        <w:rPr>
+          <w:sz w:val="28"/>
+          <w:szCs w:val="28"/>
+        </w:rPr>
+        <w:t>.</w:t>
+      </w:r>
+    </w:p>
+    <w:p>
+      <w:pPr>
+        <w:spacing w:line="360" w:lineRule="auto"/>
+        <w:jc w:val="center"/>
+        <w:rPr>
+          <w:sz w:val="28"/>
+          <w:szCs w:val="28"/>
+        </w:rPr>
+      </w:pPr>
+    </w:p>
+    <w:p>
+      <w:pPr>
+        <w:spacing w:line="360" w:lineRule="auto"/>
+        <w:ind w:firstLine="709"/>
+        <w:jc w:val="both"/>
+        <w:rPr>
+          <w:sz w:val="28"/>
+          <w:szCs w:val="28"/>
+        </w:rPr>
+      </w:pPr>
       <w:r>
         <w:rPr>
           <w:b/>
@@ -1090,6 +1326,24 @@
           <w:sz w:val="28"/>
           <w:szCs w:val="28"/>
         </w:rPr>
+        <w:t xml:space="preserve">Пример </w:t>
+      </w:r>
+      <w:r>
+        <w:rPr>
+          <w:b/>
+          <w:bCs/>
+          <w:sz w:val="28"/>
+          <w:szCs w:val="28"/>
+        </w:rPr>
+        <w:t>5.8</w:t>
+      </w:r>
+      <w:r>
+        <w:rPr>
+          <w:b/>
+          <w:bCs/>
+          <w:sz w:val="28"/>
+          <w:szCs w:val="28"/>
+        </w:rPr>
         <w:t>.</w:t>
       </w:r>
       <w:r>
@@ -1097,51 +1351,110 @@
           <w:sz w:val="28"/>
           <w:szCs w:val="28"/>
         </w:rPr>
-        <w:t xml:space="preserve"> В ходе выполнения данного примера была построена прямая, заданная двумя точками, в пространстве.</w:t>
-      </w:r>
-    </w:p>
-    <w:p>
-      <w:pPr>
-        <w:pStyle w:val="a8"/>
-        <w:spacing w:line="360" w:lineRule="auto"/>
-        <w:jc w:val="center"/>
-        <w:rPr>
-          <w:rFonts w:ascii="Times New Roman" w:hAnsi="Times New Roman"/>
-          <w:sz w:val="28"/>
-          <w:szCs w:val="28"/>
-          <w:lang w:val="ru-RU"/>
-        </w:rPr>
-      </w:pPr>
-    </w:p>
-    <w:p>
-      <w:pPr>
-        <w:spacing w:line="360" w:lineRule="auto"/>
-        <w:jc w:val="center"/>
-        <w:rPr>
-          <w:sz w:val="28"/>
-          <w:szCs w:val="28"/>
-        </w:rPr>
-      </w:pPr>
-      <w:r>
-        <w:rPr>
-          <w:sz w:val="28"/>
-          <w:szCs w:val="28"/>
-        </w:rPr>
-        <w:t xml:space="preserve">Рисунок 1. Выполнение пример </w:t>
-      </w:r>
-      <w:r>
-        <w:rPr>
-          <w:sz w:val="28"/>
-          <w:szCs w:val="28"/>
-        </w:rPr>
-        <w:t>3</w:t>
-      </w:r>
-      <w:r>
-        <w:rPr>
-          <w:sz w:val="28"/>
-          <w:szCs w:val="28"/>
-        </w:rPr>
-        <w:t>.1</w:t>
+        <w:t xml:space="preserve"> В ходе выполнения данного примера была построена </w:t>
+      </w:r>
+      <w:r>
+        <w:rPr>
+          <w:sz w:val="28"/>
+          <w:szCs w:val="28"/>
+        </w:rPr>
+        <w:t>касательная и нормаль к кривой.</w:t>
+      </w:r>
+    </w:p>
+    <w:p>
+      <w:pPr>
+        <w:spacing w:line="360" w:lineRule="auto"/>
+        <w:jc w:val="center"/>
+        <w:rPr>
+          <w:sz w:val="28"/>
+          <w:szCs w:val="28"/>
+        </w:rPr>
+      </w:pPr>
+      <w:r>
+        <w:rPr>
+          <w:sz w:val="28"/>
+          <w:szCs w:val="28"/>
+        </w:rPr>
+        <w:drawing>
+          <wp:inline distT="0" distB="0" distL="0" distR="0" wp14:anchorId="5E78EC2D" wp14:editId="698B4100">
+            <wp:extent cx="3212009" cy="3634740"/>
+            <wp:effectExtent l="0" t="0" r="0" b="0"/>
+            <wp:docPr id="3" name="Рисунок 3"/>
+            <wp:cNvGraphicFramePr>
+              <a:graphicFrameLocks xmlns:a="http://schemas.openxmlformats.org/drawingml/2006/main" noChangeAspect="1"/>
+            </wp:cNvGraphicFramePr>
+            <a:graphic xmlns:a="http://schemas.openxmlformats.org/drawingml/2006/main">
+              <a:graphicData uri="http://schemas.openxmlformats.org/drawingml/2006/picture">
+                <pic:pic xmlns:pic="http://schemas.openxmlformats.org/drawingml/2006/picture">
+                  <pic:nvPicPr>
+                    <pic:cNvPr id="1" name=""/>
+                    <pic:cNvPicPr/>
+                  </pic:nvPicPr>
+                  <pic:blipFill rotWithShape="1">
+                    <a:blip r:embed="rId8"/>
+                    <a:srcRect t="6893"/>
+                    <a:stretch/>
+                  </pic:blipFill>
+                  <pic:spPr bwMode="auto">
+                    <a:xfrm>
+                      <a:off x="0" y="0"/>
+                      <a:ext cx="3221810" cy="3645830"/>
+                    </a:xfrm>
+                    <a:prstGeom prst="rect">
+                      <a:avLst/>
+                    </a:prstGeom>
+                    <a:ln>
+                      <a:noFill/>
+                    </a:ln>
+                    <a:extLst>
+                      <a:ext uri="{53640926-AAD7-44D8-BBD7-CCE9431645EC}">
+                        <a14:shadowObscured xmlns:a14="http://schemas.microsoft.com/office/drawing/2010/main"/>
+                      </a:ext>
+                    </a:extLst>
+                  </pic:spPr>
+                </pic:pic>
+              </a:graphicData>
+            </a:graphic>
+          </wp:inline>
+        </w:drawing>
+      </w:r>
+    </w:p>
+    <w:p>
+      <w:pPr>
+        <w:spacing w:line="360" w:lineRule="auto"/>
+        <w:jc w:val="center"/>
+        <w:rPr>
+          <w:sz w:val="28"/>
+          <w:szCs w:val="28"/>
+        </w:rPr>
+      </w:pPr>
+      <w:r>
+        <w:rPr>
+          <w:sz w:val="28"/>
+          <w:szCs w:val="28"/>
+        </w:rPr>
+        <w:t xml:space="preserve">Рисунок </w:t>
+      </w:r>
+      <w:r>
+        <w:rPr>
+          <w:sz w:val="28"/>
+          <w:szCs w:val="28"/>
+        </w:rPr>
+        <w:t>3.</w:t>
+      </w:r>
+      <w:r>
+        <w:rPr>
+          <w:sz w:val="28"/>
+          <w:szCs w:val="28"/>
+        </w:rPr>
+        <w:t xml:space="preserve"> Выполнение примера 5.</w:t>
+      </w:r>
+      <w:r>
+        <w:rPr>
+          <w:sz w:val="28"/>
+          <w:szCs w:val="28"/>
+        </w:rPr>
+        <w:t>8</w:t>
       </w:r>
       <w:r>
         <w:rPr>
@@ -1168,6 +1481,7 @@
           <w:sz w:val="28"/>
           <w:szCs w:val="28"/>
         </w:rPr>
+        <w:lastRenderedPageBreak/>
         <w:t xml:space="preserve">Пример </w:t>
       </w:r>
       <w:r>
@@ -1177,7 +1491,7 @@
           <w:sz w:val="28"/>
           <w:szCs w:val="28"/>
         </w:rPr>
-        <w:t>5.8</w:t>
+        <w:t>5.9</w:t>
       </w:r>
       <w:r>
         <w:rPr>
@@ -1193,7 +1507,109 @@
           <w:sz w:val="28"/>
           <w:szCs w:val="28"/>
         </w:rPr>
-        <w:t xml:space="preserve"> В ходе выполнения данного примера была построена прямая, заданная двумя точками, в пространстве.</w:t>
+        <w:t xml:space="preserve"> В ходе выполнения данного примера была построена </w:t>
+      </w:r>
+      <w:r>
+        <w:rPr>
+          <w:sz w:val="28"/>
+          <w:szCs w:val="28"/>
+        </w:rPr>
+        <w:t>касательная и нормаль к кривой, которая задана параметрически.</w:t>
+      </w:r>
+    </w:p>
+    <w:p>
+      <w:pPr>
+        <w:spacing w:line="360" w:lineRule="auto"/>
+        <w:jc w:val="center"/>
+        <w:rPr>
+          <w:sz w:val="28"/>
+          <w:szCs w:val="28"/>
+        </w:rPr>
+      </w:pPr>
+      <w:r>
+        <w:rPr>
+          <w:sz w:val="28"/>
+          <w:szCs w:val="28"/>
+        </w:rPr>
+        <w:drawing>
+          <wp:inline distT="0" distB="0" distL="0" distR="0" wp14:anchorId="4428BD33" wp14:editId="092970A7">
+            <wp:extent cx="3329940" cy="4870754"/>
+            <wp:effectExtent l="0" t="0" r="0" b="0"/>
+            <wp:docPr id="4" name="Рисунок 4"/>
+            <wp:cNvGraphicFramePr>
+              <a:graphicFrameLocks xmlns:a="http://schemas.openxmlformats.org/drawingml/2006/main" noChangeAspect="1"/>
+            </wp:cNvGraphicFramePr>
+            <a:graphic xmlns:a="http://schemas.openxmlformats.org/drawingml/2006/main">
+              <a:graphicData uri="http://schemas.openxmlformats.org/drawingml/2006/picture">
+                <pic:pic xmlns:pic="http://schemas.openxmlformats.org/drawingml/2006/picture">
+                  <pic:nvPicPr>
+                    <pic:cNvPr id="1" name=""/>
+                    <pic:cNvPicPr/>
+                  </pic:nvPicPr>
+                  <pic:blipFill>
+                    <a:blip r:embed="rId9"/>
+                    <a:stretch>
+                      <a:fillRect/>
+                    </a:stretch>
+                  </pic:blipFill>
+                  <pic:spPr>
+                    <a:xfrm>
+                      <a:off x="0" y="0"/>
+                      <a:ext cx="3334016" cy="4876716"/>
+                    </a:xfrm>
+                    <a:prstGeom prst="rect">
+                      <a:avLst/>
+                    </a:prstGeom>
+                  </pic:spPr>
+                </pic:pic>
+              </a:graphicData>
+            </a:graphic>
+          </wp:inline>
+        </w:drawing>
+      </w:r>
+    </w:p>
+    <w:p>
+      <w:pPr>
+        <w:spacing w:line="360" w:lineRule="auto"/>
+        <w:jc w:val="center"/>
+        <w:rPr>
+          <w:sz w:val="28"/>
+          <w:szCs w:val="28"/>
+        </w:rPr>
+      </w:pPr>
+      <w:r>
+        <w:rPr>
+          <w:sz w:val="28"/>
+          <w:szCs w:val="28"/>
+        </w:rPr>
+        <w:t>Рисунок 4. Выполнение примера 5.9.</w:t>
+      </w:r>
+    </w:p>
+    <w:p>
+      <w:pPr>
+        <w:spacing w:line="360" w:lineRule="auto"/>
+        <w:jc w:val="center"/>
+        <w:rPr>
+          <w:sz w:val="28"/>
+          <w:szCs w:val="28"/>
+        </w:rPr>
+      </w:pPr>
+    </w:p>
+    <w:p>
+      <w:pPr>
+        <w:spacing w:line="360" w:lineRule="auto"/>
+        <w:jc w:val="center"/>
+        <w:rPr>
+          <w:sz w:val="28"/>
+          <w:szCs w:val="28"/>
+        </w:rPr>
+      </w:pPr>
+      <w:r>
+        <w:rPr>
+          <w:sz w:val="28"/>
+          <w:szCs w:val="28"/>
+        </w:rPr>
+        <w:t>ЗАДАНИЕ 2 (вариант 14).</w:t>
       </w:r>
     </w:p>
     <w:p>
@@ -1204,41 +1620,352 @@
         <w:rPr>
           <w:sz w:val="28"/>
           <w:szCs w:val="28"/>
-        </w:rPr>
-      </w:pPr>
-      <w:r>
+          <w:lang w:val="en-US"/>
+        </w:rPr>
+      </w:pPr>
+      <w:r>
+        <w:rPr>
+          <w:sz w:val="28"/>
+          <w:szCs w:val="28"/>
+        </w:rPr>
+        <w:t>Построить на плоскости кривую, заданную параметрически</w:t>
+      </w:r>
+      <w:r>
+        <w:rPr>
+          <w:sz w:val="28"/>
+          <w:szCs w:val="28"/>
+        </w:rPr>
+        <w:t xml:space="preserve">: </w:t>
+      </w:r>
+      <w:r>
+        <w:rPr>
+          <w:sz w:val="28"/>
+          <w:szCs w:val="28"/>
+          <w:lang w:val="en-US"/>
+        </w:rPr>
+        <w:t xml:space="preserve">x(t) = </w:t>
+      </w:r>
+      <w:r>
+        <w:rPr>
+          <w:sz w:val="28"/>
+          <w:szCs w:val="28"/>
+        </w:rPr>
+        <w:t>6</w:t>
+      </w:r>
+      <w:r>
+        <w:rPr>
+          <w:sz w:val="28"/>
+          <w:szCs w:val="28"/>
+          <w:lang w:val="en-US"/>
+        </w:rPr>
+        <w:t>*</w:t>
+      </w:r>
+      <w:proofErr w:type="spellStart"/>
+      <w:r>
+        <w:rPr>
+          <w:sz w:val="28"/>
+          <w:szCs w:val="28"/>
+        </w:rPr>
+        <w:t>cos</w:t>
+      </w:r>
+      <w:proofErr w:type="spellEnd"/>
+      <w:r>
+        <w:rPr>
+          <w:sz w:val="28"/>
+          <w:szCs w:val="28"/>
+          <w:lang w:val="en-US"/>
+        </w:rPr>
+        <w:t>(</w:t>
+      </w:r>
+      <w:r>
+        <w:rPr>
+          <w:sz w:val="28"/>
+          <w:szCs w:val="28"/>
+        </w:rPr>
+        <w:t>4t</w:t>
+      </w:r>
+      <w:r>
+        <w:rPr>
+          <w:sz w:val="28"/>
+          <w:szCs w:val="28"/>
+          <w:lang w:val="en-US"/>
+        </w:rPr>
+        <w:t>)</w:t>
+      </w:r>
+      <w:r>
+        <w:rPr>
+          <w:sz w:val="28"/>
+          <w:szCs w:val="28"/>
+        </w:rPr>
+        <w:t xml:space="preserve"> + 1</w:t>
+      </w:r>
+      <w:r>
+        <w:rPr>
+          <w:sz w:val="28"/>
+          <w:szCs w:val="28"/>
+          <w:lang w:val="en-US"/>
+        </w:rPr>
+        <w:t xml:space="preserve">, y(t) = </w:t>
+      </w:r>
+      <w:r>
+        <w:rPr>
+          <w:sz w:val="28"/>
+          <w:szCs w:val="28"/>
+        </w:rPr>
+        <w:t>4</w:t>
+      </w:r>
+      <w:r>
+        <w:rPr>
+          <w:sz w:val="28"/>
+          <w:szCs w:val="28"/>
+          <w:lang w:val="en-US"/>
+        </w:rPr>
+        <w:t>*</w:t>
+      </w:r>
+      <w:proofErr w:type="spellStart"/>
+      <w:r>
+        <w:rPr>
+          <w:sz w:val="28"/>
+          <w:szCs w:val="28"/>
+        </w:rPr>
+        <w:t>sin</w:t>
+      </w:r>
+      <w:proofErr w:type="spellEnd"/>
+      <w:r>
+        <w:rPr>
+          <w:sz w:val="28"/>
+          <w:szCs w:val="28"/>
+          <w:lang w:val="en-US"/>
+        </w:rPr>
+        <w:t>(</w:t>
+      </w:r>
+      <w:r>
+        <w:rPr>
+          <w:sz w:val="28"/>
+          <w:szCs w:val="28"/>
+        </w:rPr>
+        <w:t>4t</w:t>
+      </w:r>
+      <w:r>
+        <w:rPr>
+          <w:sz w:val="28"/>
+          <w:szCs w:val="28"/>
+          <w:lang w:val="en-US"/>
+        </w:rPr>
+        <w:t>)</w:t>
+      </w:r>
+      <w:r>
+        <w:rPr>
+          <w:sz w:val="28"/>
+          <w:szCs w:val="28"/>
+        </w:rPr>
+        <w:t xml:space="preserve"> </w:t>
+      </w:r>
+      <w:r>
+        <w:rPr>
+          <w:sz w:val="28"/>
+          <w:szCs w:val="28"/>
+        </w:rPr>
+        <w:t>–</w:t>
+      </w:r>
+      <w:r>
+        <w:rPr>
+          <w:sz w:val="28"/>
+          <w:szCs w:val="28"/>
+        </w:rPr>
+        <w:t xml:space="preserve"> 5</w:t>
+      </w:r>
+      <w:r>
+        <w:rPr>
+          <w:sz w:val="28"/>
+          <w:szCs w:val="28"/>
+          <w:lang w:val="en-US"/>
+        </w:rPr>
+        <w:t>.</w:t>
+      </w:r>
+      <w:r>
+        <w:rPr>
+          <w:sz w:val="28"/>
+          <w:szCs w:val="28"/>
+          <w:lang w:val="en-US"/>
+        </w:rPr>
+        <w:t xml:space="preserve"> </w:t>
+      </w:r>
+      <w:r>
+        <w:rPr>
+          <w:sz w:val="28"/>
+          <w:szCs w:val="28"/>
+        </w:rPr>
+        <w:t>На другом рисунке построить ту же кривую с помощью явного представления. Масштаб систем координат на рисунках должен быть одинаковым.</w:t>
+      </w:r>
+    </w:p>
+    <w:p>
+      <w:pPr>
+        <w:spacing w:line="360" w:lineRule="auto"/>
+        <w:jc w:val="center"/>
+        <w:rPr>
+          <w:sz w:val="28"/>
+          <w:szCs w:val="28"/>
+        </w:rPr>
+      </w:pPr>
+      <w:r>
+        <w:rPr>
+          <w:sz w:val="28"/>
+          <w:szCs w:val="28"/>
+        </w:rPr>
+        <w:t>ВЫПОЛНЕНИЕ РАБОТЫ:</w:t>
+      </w:r>
+    </w:p>
+    <w:p>
+      <w:pPr>
+        <w:spacing w:line="360" w:lineRule="auto"/>
+        <w:ind w:firstLine="709"/>
+        <w:jc w:val="both"/>
+        <w:rPr>
+          <w:sz w:val="28"/>
+          <w:szCs w:val="28"/>
+        </w:rPr>
+      </w:pPr>
+      <w:r>
+        <w:rPr>
+          <w:sz w:val="28"/>
+          <w:szCs w:val="28"/>
+        </w:rPr>
+        <w:t xml:space="preserve">Для выполнения данного задания </w:t>
+      </w:r>
+      <w:r>
+        <w:rPr>
+          <w:sz w:val="28"/>
+          <w:szCs w:val="28"/>
+        </w:rPr>
+        <w:t xml:space="preserve">на одном рисунке </w:t>
+      </w:r>
+      <w:r>
+        <w:rPr>
+          <w:sz w:val="28"/>
+          <w:szCs w:val="28"/>
+        </w:rPr>
+        <w:t>была построена кривая, заданная параметрически.</w:t>
+      </w:r>
+      <w:r>
+        <w:rPr>
+          <w:sz w:val="28"/>
+          <w:szCs w:val="28"/>
+        </w:rPr>
+        <w:t xml:space="preserve"> На другом рисунке была построена та же кривая, но с использованием явного представления.</w:t>
+      </w:r>
+      <w:r>
+        <w:rPr>
+          <w:sz w:val="28"/>
+          <w:szCs w:val="28"/>
+        </w:rPr>
+        <w:t xml:space="preserve"> </w:t>
+      </w:r>
+    </w:p>
+    <w:p>
+      <w:pPr>
+        <w:spacing w:line="360" w:lineRule="auto"/>
+        <w:jc w:val="both"/>
         <w:rPr>
           <w:b/>
           <w:bCs/>
           <w:sz w:val="28"/>
           <w:szCs w:val="28"/>
         </w:rPr>
-        <w:t xml:space="preserve">Пример </w:t>
-      </w:r>
-      <w:r>
-        <w:rPr>
-          <w:b/>
-          <w:bCs/>
-          <w:sz w:val="28"/>
-          <w:szCs w:val="28"/>
-        </w:rPr>
-        <w:t>5.9</w:t>
-      </w:r>
-      <w:r>
-        <w:rPr>
-          <w:b/>
-          <w:bCs/>
+      </w:pPr>
+      <w:r>
+        <w:rPr>
+          <w:sz w:val="28"/>
+          <w:szCs w:val="28"/>
+        </w:rPr>
+        <w:lastRenderedPageBreak/>
+        <w:drawing>
+          <wp:inline distT="0" distB="0" distL="0" distR="0" wp14:anchorId="622B0CFD" wp14:editId="357B8962">
+            <wp:extent cx="5940425" cy="3887923"/>
+            <wp:effectExtent l="0" t="0" r="0" b="0"/>
+            <wp:docPr id="6" name="Рисунок 6"/>
+            <wp:cNvGraphicFramePr>
+              <a:graphicFrameLocks xmlns:a="http://schemas.openxmlformats.org/drawingml/2006/main" noChangeAspect="1"/>
+            </wp:cNvGraphicFramePr>
+            <a:graphic xmlns:a="http://schemas.openxmlformats.org/drawingml/2006/main">
+              <a:graphicData uri="http://schemas.openxmlformats.org/drawingml/2006/picture">
+                <pic:pic xmlns:pic="http://schemas.openxmlformats.org/drawingml/2006/picture">
+                  <pic:nvPicPr>
+                    <pic:cNvPr id="1" name=""/>
+                    <pic:cNvPicPr/>
+                  </pic:nvPicPr>
+                  <pic:blipFill rotWithShape="1">
+                    <a:blip r:embed="rId10"/>
+                    <a:srcRect t="1517"/>
+                    <a:stretch/>
+                  </pic:blipFill>
+                  <pic:spPr bwMode="auto">
+                    <a:xfrm>
+                      <a:off x="0" y="0"/>
+                      <a:ext cx="5940425" cy="3887923"/>
+                    </a:xfrm>
+                    <a:prstGeom prst="rect">
+                      <a:avLst/>
+                    </a:prstGeom>
+                    <a:ln>
+                      <a:noFill/>
+                    </a:ln>
+                    <a:extLst>
+                      <a:ext uri="{53640926-AAD7-44D8-BBD7-CCE9431645EC}">
+                        <a14:shadowObscured xmlns:a14="http://schemas.microsoft.com/office/drawing/2010/main"/>
+                      </a:ext>
+                    </a:extLst>
+                  </pic:spPr>
+                </pic:pic>
+              </a:graphicData>
+            </a:graphic>
+          </wp:inline>
+        </w:drawing>
+      </w:r>
+    </w:p>
+    <w:p>
+      <w:pPr>
+        <w:spacing w:line="360" w:lineRule="auto"/>
+        <w:jc w:val="center"/>
+        <w:rPr>
+          <w:sz w:val="28"/>
+          <w:szCs w:val="28"/>
+        </w:rPr>
+      </w:pPr>
+      <w:r>
+        <w:rPr>
+          <w:sz w:val="28"/>
+          <w:szCs w:val="28"/>
+        </w:rPr>
+        <w:t xml:space="preserve">Рисунок </w:t>
+      </w:r>
+      <w:r>
+        <w:rPr>
+          <w:sz w:val="28"/>
+          <w:szCs w:val="28"/>
+        </w:rPr>
+        <w:t>5</w:t>
+      </w:r>
+      <w:r>
+        <w:rPr>
+          <w:sz w:val="28"/>
+          <w:szCs w:val="28"/>
+        </w:rPr>
+        <w:t xml:space="preserve">. </w:t>
+      </w:r>
+      <w:r>
+        <w:rPr>
+          <w:sz w:val="28"/>
+          <w:szCs w:val="28"/>
+        </w:rPr>
+        <w:t>Выполнение задания 2</w:t>
+      </w:r>
+      <w:r>
+        <w:rPr>
           <w:sz w:val="28"/>
           <w:szCs w:val="28"/>
         </w:rPr>
         <w:t>.</w:t>
-      </w:r>
-      <w:r>
-        <w:rPr>
-          <w:sz w:val="28"/>
-          <w:szCs w:val="28"/>
-        </w:rPr>
-        <w:t xml:space="preserve"> В ходе выполнения данного примера была построена прямая, заданная двумя точками, в пространстве.</w:t>
       </w:r>
     </w:p>
     <w:p>
@@ -1266,7 +1993,7 @@
           <w:sz w:val="28"/>
           <w:szCs w:val="28"/>
         </w:rPr>
-        <w:t>ЗАДАНИЕ 2 (вариант 14).</w:t>
+        <w:t>ЗАДАНИЕ 3 (вариант 14).</w:t>
       </w:r>
     </w:p>
     <w:p>
@@ -1277,183 +2004,14 @@
         <w:rPr>
           <w:sz w:val="28"/>
           <w:szCs w:val="28"/>
-          <w:lang w:val="en-US"/>
-        </w:rPr>
-      </w:pPr>
-      <w:r>
-        <w:rPr>
-          <w:sz w:val="28"/>
-          <w:szCs w:val="28"/>
-        </w:rPr>
-        <w:t>Построить на плоскости кривую, заданную параметрически</w:t>
-      </w:r>
-      <w:r>
-        <w:rPr>
-          <w:sz w:val="28"/>
-          <w:szCs w:val="28"/>
-        </w:rPr>
-        <w:t xml:space="preserve">: </w:t>
-      </w:r>
-      <w:r>
-        <w:rPr>
-          <w:sz w:val="28"/>
-          <w:szCs w:val="28"/>
-          <w:lang w:val="en-US"/>
-        </w:rPr>
-        <w:t xml:space="preserve">x(t) = </w:t>
-      </w:r>
-      <w:r>
-        <w:rPr>
-          <w:sz w:val="28"/>
-          <w:szCs w:val="28"/>
-        </w:rPr>
-        <w:t>6</w:t>
-      </w:r>
-      <w:r>
-        <w:rPr>
-          <w:sz w:val="28"/>
-          <w:szCs w:val="28"/>
-          <w:lang w:val="en-US"/>
-        </w:rPr>
-        <w:t>*</w:t>
-      </w:r>
-      <w:proofErr w:type="spellStart"/>
-      <w:r>
-        <w:rPr>
-          <w:sz w:val="28"/>
-          <w:szCs w:val="28"/>
-        </w:rPr>
-        <w:t>cos</w:t>
-      </w:r>
-      <w:proofErr w:type="spellEnd"/>
-      <w:r>
-        <w:rPr>
-          <w:sz w:val="28"/>
-          <w:szCs w:val="28"/>
-          <w:lang w:val="en-US"/>
-        </w:rPr>
-        <w:t>(</w:t>
-      </w:r>
-      <w:r>
-        <w:rPr>
-          <w:sz w:val="28"/>
-          <w:szCs w:val="28"/>
-        </w:rPr>
-        <w:t>4t</w:t>
-      </w:r>
-      <w:r>
-        <w:rPr>
-          <w:sz w:val="28"/>
-          <w:szCs w:val="28"/>
-          <w:lang w:val="en-US"/>
-        </w:rPr>
-        <w:t>)</w:t>
-      </w:r>
-      <w:r>
-        <w:rPr>
-          <w:sz w:val="28"/>
-          <w:szCs w:val="28"/>
-        </w:rPr>
-        <w:t xml:space="preserve"> + 1</w:t>
-      </w:r>
-      <w:r>
-        <w:rPr>
-          <w:sz w:val="28"/>
-          <w:szCs w:val="28"/>
-          <w:lang w:val="en-US"/>
-        </w:rPr>
-        <w:t xml:space="preserve">, y(t) = </w:t>
-      </w:r>
-      <w:r>
-        <w:rPr>
-          <w:sz w:val="28"/>
-          <w:szCs w:val="28"/>
-        </w:rPr>
-        <w:t>4</w:t>
-      </w:r>
-      <w:r>
-        <w:rPr>
-          <w:sz w:val="28"/>
-          <w:szCs w:val="28"/>
-          <w:lang w:val="en-US"/>
-        </w:rPr>
-        <w:t>*</w:t>
-      </w:r>
-      <w:proofErr w:type="spellStart"/>
-      <w:r>
-        <w:rPr>
-          <w:sz w:val="28"/>
-          <w:szCs w:val="28"/>
-        </w:rPr>
-        <w:t>sin</w:t>
-      </w:r>
-      <w:proofErr w:type="spellEnd"/>
-      <w:r>
-        <w:rPr>
-          <w:sz w:val="28"/>
-          <w:szCs w:val="28"/>
-          <w:lang w:val="en-US"/>
-        </w:rPr>
-        <w:t>(</w:t>
-      </w:r>
-      <w:r>
-        <w:rPr>
-          <w:sz w:val="28"/>
-          <w:szCs w:val="28"/>
-        </w:rPr>
-        <w:t>4t</w:t>
-      </w:r>
-      <w:r>
-        <w:rPr>
-          <w:sz w:val="28"/>
-          <w:szCs w:val="28"/>
-          <w:lang w:val="en-US"/>
-        </w:rPr>
-        <w:t>)</w:t>
-      </w:r>
-      <w:r>
-        <w:rPr>
-          <w:sz w:val="28"/>
-          <w:szCs w:val="28"/>
-        </w:rPr>
-        <w:t xml:space="preserve"> </w:t>
-      </w:r>
-      <w:r>
-        <w:rPr>
-          <w:sz w:val="28"/>
-          <w:szCs w:val="28"/>
-        </w:rPr>
-        <w:t>–</w:t>
-      </w:r>
-      <w:r>
-        <w:rPr>
-          <w:sz w:val="28"/>
-          <w:szCs w:val="28"/>
-        </w:rPr>
-        <w:t xml:space="preserve"> 5</w:t>
-      </w:r>
-      <w:r>
-        <w:rPr>
-          <w:sz w:val="28"/>
-          <w:szCs w:val="28"/>
-          <w:lang w:val="en-US"/>
-        </w:rPr>
-        <w:t>.</w:t>
-      </w:r>
-      <w:r>
-        <w:rPr>
-          <w:sz w:val="28"/>
-          <w:szCs w:val="28"/>
-          <w:lang w:val="en-US"/>
-        </w:rPr>
-        <w:t xml:space="preserve"> </w:t>
-      </w:r>
-      <w:r>
-        <w:rPr>
-          <w:sz w:val="28"/>
-          <w:szCs w:val="28"/>
-        </w:rPr>
-        <w:t>На другом рисунке построить ту же кривую с помощью явного представления. Масштаб систем координат на рисунках должен быть одинаковым.</w:t>
+        </w:rPr>
+      </w:pPr>
+      <w:r>
+        <w:rPr>
+          <w:sz w:val="28"/>
+          <w:szCs w:val="28"/>
+        </w:rPr>
+        <w:t>Построить на плоскости кривые второго порядка с использованием непараметрического представления в соответствие с заданными параметрами согласно номеру варианта. Построить те же кривые второго порядка с использованием параметрического представления.</w:t>
       </w:r>
     </w:p>
     <w:p>
@@ -1488,7 +2046,298 @@
           <w:sz w:val="28"/>
           <w:szCs w:val="28"/>
         </w:rPr>
-        <w:t>Для выполнения данного задания было выполнено несколько примеров, которые продемонстрированы в методическом указании.</w:t>
+        <w:t>Для выполнения данного задания были построены кривые второго порядка с использованием непараметрического представления</w:t>
+      </w:r>
+      <w:r>
+        <w:rPr>
+          <w:sz w:val="28"/>
+          <w:szCs w:val="28"/>
+        </w:rPr>
+        <w:t>. Ниже были построены те же кривые второго порядка, но с использованием параметрического представления.</w:t>
+      </w:r>
+    </w:p>
+    <w:p>
+      <w:pPr>
+        <w:spacing w:line="360" w:lineRule="auto"/>
+        <w:jc w:val="both"/>
+        <w:rPr>
+          <w:sz w:val="28"/>
+          <w:szCs w:val="28"/>
+          <w:lang w:val="en-US"/>
+        </w:rPr>
+      </w:pPr>
+      <w:r>
+        <w:rPr>
+          <w:noProof/>
+          <w:sz w:val="28"/>
+          <w:szCs w:val="28"/>
+        </w:rPr>
+        <w:lastRenderedPageBreak/>
+        <w:drawing>
+          <wp:inline distT="0" distB="0" distL="0" distR="0" wp14:anchorId="0AD5F67E" wp14:editId="3127F7D8">
+            <wp:extent cx="5929630" cy="2521585"/>
+            <wp:effectExtent l="0" t="0" r="0" b="0"/>
+            <wp:docPr id="8" name="Рисунок 8"/>
+            <wp:cNvGraphicFramePr>
+              <a:graphicFrameLocks xmlns:a="http://schemas.openxmlformats.org/drawingml/2006/main" noChangeAspect="1"/>
+            </wp:cNvGraphicFramePr>
+            <a:graphic xmlns:a="http://schemas.openxmlformats.org/drawingml/2006/main">
+              <a:graphicData uri="http://schemas.openxmlformats.org/drawingml/2006/picture">
+                <pic:pic xmlns:pic="http://schemas.openxmlformats.org/drawingml/2006/picture">
+                  <pic:nvPicPr>
+                    <pic:cNvPr id="0" name="Picture 1"/>
+                    <pic:cNvPicPr>
+                      <a:picLocks noChangeAspect="1" noChangeArrowheads="1"/>
+                    </pic:cNvPicPr>
+                  </pic:nvPicPr>
+                  <pic:blipFill>
+                    <a:blip r:embed="rId11" cstate="print">
+                      <a:extLst>
+                        <a:ext uri="{28A0092B-C50C-407E-A947-70E740481C1C}">
+                          <a14:useLocalDpi xmlns:a14="http://schemas.microsoft.com/office/drawing/2010/main" val="0"/>
+                        </a:ext>
+                      </a:extLst>
+                    </a:blip>
+                    <a:srcRect/>
+                    <a:stretch>
+                      <a:fillRect/>
+                    </a:stretch>
+                  </pic:blipFill>
+                  <pic:spPr bwMode="auto">
+                    <a:xfrm>
+                      <a:off x="0" y="0"/>
+                      <a:ext cx="5929630" cy="2521585"/>
+                    </a:xfrm>
+                    <a:prstGeom prst="rect">
+                      <a:avLst/>
+                    </a:prstGeom>
+                    <a:noFill/>
+                    <a:ln>
+                      <a:noFill/>
+                    </a:ln>
+                  </pic:spPr>
+                </pic:pic>
+              </a:graphicData>
+            </a:graphic>
+          </wp:inline>
+        </w:drawing>
+      </w:r>
+    </w:p>
+    <w:p>
+      <w:pPr>
+        <w:spacing w:line="360" w:lineRule="auto"/>
+        <w:jc w:val="center"/>
+        <w:rPr>
+          <w:sz w:val="28"/>
+          <w:szCs w:val="28"/>
+        </w:rPr>
+      </w:pPr>
+      <w:r>
+        <w:rPr>
+          <w:sz w:val="28"/>
+          <w:szCs w:val="28"/>
+        </w:rPr>
+        <w:t xml:space="preserve">Рисунок </w:t>
+      </w:r>
+      <w:r>
+        <w:rPr>
+          <w:sz w:val="28"/>
+          <w:szCs w:val="28"/>
+          <w:lang w:val="en-US"/>
+        </w:rPr>
+        <w:t>6</w:t>
+      </w:r>
+      <w:r>
+        <w:rPr>
+          <w:sz w:val="28"/>
+          <w:szCs w:val="28"/>
+        </w:rPr>
+        <w:t xml:space="preserve">. Выполнение задания </w:t>
+      </w:r>
+      <w:r>
+        <w:rPr>
+          <w:sz w:val="28"/>
+          <w:szCs w:val="28"/>
+          <w:lang w:val="en-US"/>
+        </w:rPr>
+        <w:t>3</w:t>
+      </w:r>
+      <w:r>
+        <w:rPr>
+          <w:sz w:val="28"/>
+          <w:szCs w:val="28"/>
+        </w:rPr>
+        <w:t>.</w:t>
+      </w:r>
+      <w:r>
+        <w:rPr>
+          <w:sz w:val="28"/>
+          <w:szCs w:val="28"/>
+          <w:lang w:val="en-US"/>
+        </w:rPr>
+        <w:t xml:space="preserve"> </w:t>
+      </w:r>
+      <w:r>
+        <w:rPr>
+          <w:sz w:val="28"/>
+          <w:szCs w:val="28"/>
+        </w:rPr>
+        <w:t>Часть 1.</w:t>
+      </w:r>
+    </w:p>
+    <w:p>
+      <w:pPr>
+        <w:spacing w:line="360" w:lineRule="auto"/>
+        <w:jc w:val="both"/>
+        <w:rPr>
+          <w:sz w:val="28"/>
+          <w:szCs w:val="28"/>
+        </w:rPr>
+      </w:pPr>
+    </w:p>
+    <w:p>
+      <w:pPr>
+        <w:spacing w:line="360" w:lineRule="auto"/>
+        <w:jc w:val="both"/>
+        <w:rPr>
+          <w:sz w:val="28"/>
+          <w:szCs w:val="28"/>
+          <w:lang w:val="en-US"/>
+        </w:rPr>
+      </w:pPr>
+      <w:r>
+        <w:rPr>
+          <w:noProof/>
+          <w:sz w:val="28"/>
+          <w:szCs w:val="28"/>
+          <w:lang w:val="en-US"/>
+        </w:rPr>
+        <w:drawing>
+          <wp:inline distT="0" distB="0" distL="0" distR="0" wp14:anchorId="577B1B1E" wp14:editId="0C346988">
+            <wp:extent cx="5929630" cy="1607185"/>
+            <wp:effectExtent l="0" t="0" r="0" b="0"/>
+            <wp:docPr id="9" name="Рисунок 9"/>
+            <wp:cNvGraphicFramePr>
+              <a:graphicFrameLocks xmlns:a="http://schemas.openxmlformats.org/drawingml/2006/main" noChangeAspect="1"/>
+            </wp:cNvGraphicFramePr>
+            <a:graphic xmlns:a="http://schemas.openxmlformats.org/drawingml/2006/main">
+              <a:graphicData uri="http://schemas.openxmlformats.org/drawingml/2006/picture">
+                <pic:pic xmlns:pic="http://schemas.openxmlformats.org/drawingml/2006/picture">
+                  <pic:nvPicPr>
+                    <pic:cNvPr id="0" name="Picture 2"/>
+                    <pic:cNvPicPr>
+                      <a:picLocks noChangeAspect="1" noChangeArrowheads="1"/>
+                    </pic:cNvPicPr>
+                  </pic:nvPicPr>
+                  <pic:blipFill>
+                    <a:blip r:embed="rId12" cstate="print">
+                      <a:extLst>
+                        <a:ext uri="{28A0092B-C50C-407E-A947-70E740481C1C}">
+                          <a14:useLocalDpi xmlns:a14="http://schemas.microsoft.com/office/drawing/2010/main" val="0"/>
+                        </a:ext>
+                      </a:extLst>
+                    </a:blip>
+                    <a:srcRect/>
+                    <a:stretch>
+                      <a:fillRect/>
+                    </a:stretch>
+                  </pic:blipFill>
+                  <pic:spPr bwMode="auto">
+                    <a:xfrm>
+                      <a:off x="0" y="0"/>
+                      <a:ext cx="5929630" cy="1607185"/>
+                    </a:xfrm>
+                    <a:prstGeom prst="rect">
+                      <a:avLst/>
+                    </a:prstGeom>
+                    <a:noFill/>
+                    <a:ln>
+                      <a:noFill/>
+                    </a:ln>
+                  </pic:spPr>
+                </pic:pic>
+              </a:graphicData>
+            </a:graphic>
+          </wp:inline>
+        </w:drawing>
+      </w:r>
+    </w:p>
+    <w:p>
+      <w:pPr>
+        <w:spacing w:line="360" w:lineRule="auto"/>
+        <w:jc w:val="center"/>
+        <w:rPr>
+          <w:sz w:val="28"/>
+          <w:szCs w:val="28"/>
+          <w:lang w:val="en-US"/>
+        </w:rPr>
+      </w:pPr>
+      <w:r>
+        <w:rPr>
+          <w:sz w:val="28"/>
+          <w:szCs w:val="28"/>
+        </w:rPr>
+        <w:t xml:space="preserve">Рисунок </w:t>
+      </w:r>
+      <w:r>
+        <w:rPr>
+          <w:sz w:val="28"/>
+          <w:szCs w:val="28"/>
+          <w:lang w:val="en-US"/>
+        </w:rPr>
+        <w:t>7</w:t>
+      </w:r>
+      <w:r>
+        <w:rPr>
+          <w:sz w:val="28"/>
+          <w:szCs w:val="28"/>
+        </w:rPr>
+        <w:t xml:space="preserve">. Выполнение задания </w:t>
+      </w:r>
+      <w:r>
+        <w:rPr>
+          <w:sz w:val="28"/>
+          <w:szCs w:val="28"/>
+          <w:lang w:val="en-US"/>
+        </w:rPr>
+        <w:t>3</w:t>
+      </w:r>
+      <w:r>
+        <w:rPr>
+          <w:sz w:val="28"/>
+          <w:szCs w:val="28"/>
+        </w:rPr>
+        <w:t>.</w:t>
+      </w:r>
+      <w:r>
+        <w:rPr>
+          <w:sz w:val="28"/>
+          <w:szCs w:val="28"/>
+          <w:lang w:val="en-US"/>
+        </w:rPr>
+        <w:t xml:space="preserve"> </w:t>
+      </w:r>
+      <w:r>
+        <w:rPr>
+          <w:sz w:val="28"/>
+          <w:szCs w:val="28"/>
+        </w:rPr>
+        <w:t xml:space="preserve">Часть </w:t>
+      </w:r>
+      <w:r>
+        <w:rPr>
+          <w:sz w:val="28"/>
+          <w:szCs w:val="28"/>
+          <w:lang w:val="en-US"/>
+        </w:rPr>
+        <w:t>2</w:t>
+      </w:r>
+      <w:r>
+        <w:rPr>
+          <w:sz w:val="28"/>
+          <w:szCs w:val="28"/>
+        </w:rPr>
+        <w:t>.</w:t>
       </w:r>
     </w:p>
     <w:p>
@@ -1516,8 +2365,7 @@
           <w:sz w:val="28"/>
           <w:szCs w:val="28"/>
         </w:rPr>
-        <w:lastRenderedPageBreak/>
-        <w:t>ЗАДАНИЕ 3 (вариант 14).</w:t>
+        <w:t>ЗАДАНИЕ 4 (вариант 14).</w:t>
       </w:r>
     </w:p>
     <w:p>
@@ -1535,7 +2383,21 @@
           <w:sz w:val="28"/>
           <w:szCs w:val="28"/>
         </w:rPr>
-        <w:t>Построить на плоскости кривые второго порядка с использованием непараметрического представления в соответствие с заданными параметрами согласно номеру варианта. Построить те же кривые второго порядка с использованием параметрического представления.</w:t>
+        <w:t>Построить на плоскости разными цветами четыре кинематические кривые в соответствие с заданными параметрами</w:t>
+      </w:r>
+      <w:r>
+        <w:rPr>
+          <w:sz w:val="28"/>
+          <w:szCs w:val="28"/>
+        </w:rPr>
+        <w:t xml:space="preserve"> </w:t>
+      </w:r>
+      <w:r>
+        <w:rPr>
+          <w:sz w:val="28"/>
+          <w:szCs w:val="28"/>
+        </w:rPr>
+        <w:t>согласно номеру варианта.</w:t>
       </w:r>
     </w:p>
     <w:p>
@@ -1570,23 +2432,153 @@
           <w:sz w:val="28"/>
           <w:szCs w:val="28"/>
         </w:rPr>
-        <w:t xml:space="preserve">Была построена плоскость по </w:t>
-      </w:r>
-      <w:proofErr w:type="spellStart"/>
-      <w:r>
-        <w:rPr>
-          <w:sz w:val="28"/>
-          <w:szCs w:val="28"/>
-        </w:rPr>
-        <w:t>трем</w:t>
-      </w:r>
-      <w:proofErr w:type="spellEnd"/>
-      <w:r>
-        <w:rPr>
-          <w:sz w:val="28"/>
-          <w:szCs w:val="28"/>
-        </w:rPr>
-        <w:t xml:space="preserve"> точкам</w:t>
+        <w:t xml:space="preserve">Для выполнения данного задания было </w:t>
+      </w:r>
+      <w:r>
+        <w:rPr>
+          <w:sz w:val="28"/>
+          <w:szCs w:val="28"/>
+        </w:rPr>
+        <w:t xml:space="preserve">построено четыре кинематические кривые в </w:t>
+      </w:r>
+      <w:r>
+        <w:rPr>
+          <w:sz w:val="28"/>
+          <w:szCs w:val="28"/>
+        </w:rPr>
+        <w:t>соответствии</w:t>
+      </w:r>
+      <w:r>
+        <w:rPr>
+          <w:sz w:val="28"/>
+          <w:szCs w:val="28"/>
+        </w:rPr>
+        <w:t xml:space="preserve"> с вариантом задания.</w:t>
+      </w:r>
+    </w:p>
+    <w:p>
+      <w:pPr>
+        <w:spacing w:line="360" w:lineRule="auto"/>
+        <w:jc w:val="center"/>
+        <w:rPr>
+          <w:sz w:val="28"/>
+          <w:szCs w:val="28"/>
+        </w:rPr>
+      </w:pPr>
+      <w:r>
+        <w:rPr>
+          <w:sz w:val="28"/>
+          <w:szCs w:val="28"/>
+        </w:rPr>
+        <w:lastRenderedPageBreak/>
+        <w:drawing>
+          <wp:inline distT="0" distB="0" distL="0" distR="0" wp14:anchorId="5FB37641" wp14:editId="28958890">
+            <wp:extent cx="2967885" cy="5117522"/>
+            <wp:effectExtent l="0" t="0" r="0" b="0"/>
+            <wp:docPr id="10" name="Рисунок 10"/>
+            <wp:cNvGraphicFramePr>
+              <a:graphicFrameLocks xmlns:a="http://schemas.openxmlformats.org/drawingml/2006/main" noChangeAspect="1"/>
+            </wp:cNvGraphicFramePr>
+            <a:graphic xmlns:a="http://schemas.openxmlformats.org/drawingml/2006/main">
+              <a:graphicData uri="http://schemas.openxmlformats.org/drawingml/2006/picture">
+                <pic:pic xmlns:pic="http://schemas.openxmlformats.org/drawingml/2006/picture">
+                  <pic:nvPicPr>
+                    <pic:cNvPr id="1" name=""/>
+                    <pic:cNvPicPr/>
+                  </pic:nvPicPr>
+                  <pic:blipFill>
+                    <a:blip r:embed="rId13"/>
+                    <a:stretch>
+                      <a:fillRect/>
+                    </a:stretch>
+                  </pic:blipFill>
+                  <pic:spPr>
+                    <a:xfrm>
+                      <a:off x="0" y="0"/>
+                      <a:ext cx="2974412" cy="5128777"/>
+                    </a:xfrm>
+                    <a:prstGeom prst="rect">
+                      <a:avLst/>
+                    </a:prstGeom>
+                  </pic:spPr>
+                </pic:pic>
+              </a:graphicData>
+            </a:graphic>
+          </wp:inline>
+        </w:drawing>
+      </w:r>
+    </w:p>
+    <w:p>
+      <w:pPr>
+        <w:spacing w:line="360" w:lineRule="auto"/>
+        <w:jc w:val="center"/>
+        <w:rPr>
+          <w:sz w:val="28"/>
+          <w:szCs w:val="28"/>
+          <w:lang w:val="en-US"/>
+        </w:rPr>
+      </w:pPr>
+      <w:r>
+        <w:rPr>
+          <w:sz w:val="28"/>
+          <w:szCs w:val="28"/>
+        </w:rPr>
+        <w:t xml:space="preserve">Рисунок </w:t>
+      </w:r>
+      <w:r>
+        <w:rPr>
+          <w:sz w:val="28"/>
+          <w:szCs w:val="28"/>
+        </w:rPr>
+        <w:t>8</w:t>
+      </w:r>
+      <w:r>
+        <w:rPr>
+          <w:sz w:val="28"/>
+          <w:szCs w:val="28"/>
+        </w:rPr>
+        <w:t xml:space="preserve">. Выполнение задания </w:t>
+      </w:r>
+      <w:r>
+        <w:rPr>
+          <w:sz w:val="28"/>
+          <w:szCs w:val="28"/>
+        </w:rPr>
+        <w:t>4</w:t>
+      </w:r>
+      <w:r>
+        <w:rPr>
+          <w:sz w:val="28"/>
+          <w:szCs w:val="28"/>
+        </w:rPr>
+        <w:t>.</w:t>
+      </w:r>
+    </w:p>
+    <w:p>
+      <w:pPr>
+        <w:spacing w:line="360" w:lineRule="auto"/>
+        <w:jc w:val="center"/>
+        <w:rPr>
+          <w:sz w:val="28"/>
+          <w:szCs w:val="28"/>
+        </w:rPr>
+      </w:pPr>
+    </w:p>
+    <w:p>
+      <w:pPr>
+        <w:spacing w:line="360" w:lineRule="auto"/>
+        <w:jc w:val="center"/>
+        <w:rPr>
+          <w:sz w:val="28"/>
+          <w:szCs w:val="28"/>
+        </w:rPr>
+      </w:pPr>
+      <w:r>
+        <w:rPr>
+          <w:sz w:val="28"/>
+          <w:szCs w:val="28"/>
+        </w:rPr>
+        <w:t>ЗАДАНИЕ 5 (вариант 14).</w:t>
       </w:r>
     </w:p>
     <w:p>
@@ -1599,22 +2591,29 @@
           <w:szCs w:val="28"/>
         </w:rPr>
       </w:pPr>
-    </w:p>
-    <w:p>
-      <w:pPr>
-        <w:spacing w:line="360" w:lineRule="auto"/>
-        <w:jc w:val="center"/>
-        <w:rPr>
-          <w:sz w:val="28"/>
-          <w:szCs w:val="28"/>
-        </w:rPr>
-      </w:pPr>
-      <w:r>
-        <w:rPr>
-          <w:sz w:val="28"/>
-          <w:szCs w:val="28"/>
-        </w:rPr>
-        <w:t>ЗАДАНИЕ 4 (вариант 14).</w:t>
+      <w:r>
+        <w:rPr>
+          <w:sz w:val="28"/>
+          <w:szCs w:val="28"/>
+        </w:rPr>
+        <w:t>Построить функцию y=f(x), а также касательную и нормаль к этой функции в точке с абсциссой a в соответствие с номером варианта.</w:t>
+      </w:r>
+    </w:p>
+    <w:p>
+      <w:pPr>
+        <w:spacing w:line="360" w:lineRule="auto"/>
+        <w:jc w:val="center"/>
+        <w:rPr>
+          <w:sz w:val="28"/>
+          <w:szCs w:val="28"/>
+        </w:rPr>
+      </w:pPr>
+      <w:r>
+        <w:rPr>
+          <w:sz w:val="28"/>
+          <w:szCs w:val="28"/>
+        </w:rPr>
+        <w:t>ВЫПОЛНЕНИЕ РАБОТЫ:</w:t>
       </w:r>
     </w:p>
     <w:p>
@@ -1632,38 +2631,153 @@
           <w:sz w:val="28"/>
           <w:szCs w:val="28"/>
         </w:rPr>
-        <w:t>Построить на плоскости разными цветами четыре кинематические кривые в соответствие с заданными параметрами</w:t>
-      </w:r>
-      <w:r>
-        <w:rPr>
-          <w:sz w:val="28"/>
-          <w:szCs w:val="28"/>
-        </w:rPr>
-        <w:t xml:space="preserve"> </w:t>
-      </w:r>
-      <w:r>
-        <w:rPr>
-          <w:sz w:val="28"/>
-          <w:szCs w:val="28"/>
-        </w:rPr>
-        <w:t>согласно номеру варианта.</w:t>
-      </w:r>
-    </w:p>
-    <w:p>
-      <w:pPr>
-        <w:spacing w:line="360" w:lineRule="auto"/>
-        <w:jc w:val="center"/>
-        <w:rPr>
-          <w:sz w:val="28"/>
-          <w:szCs w:val="28"/>
-        </w:rPr>
-      </w:pPr>
-      <w:r>
-        <w:rPr>
-          <w:sz w:val="28"/>
-          <w:szCs w:val="28"/>
-        </w:rPr>
-        <w:t>ВЫПОЛНЕНИЕ РАБОТЫ:</w:t>
+        <w:t>Для выполнения данного задания был</w:t>
+      </w:r>
+      <w:r>
+        <w:rPr>
+          <w:sz w:val="28"/>
+          <w:szCs w:val="28"/>
+        </w:rPr>
+        <w:t>а построена функция, а также касательная и нормаль к этой функции в точке с абсциссой</w:t>
+      </w:r>
+      <w:r>
+        <w:rPr>
+          <w:sz w:val="28"/>
+          <w:szCs w:val="28"/>
+        </w:rPr>
+        <w:t xml:space="preserve"> а</w:t>
+      </w:r>
+      <w:r>
+        <w:rPr>
+          <w:sz w:val="28"/>
+          <w:szCs w:val="28"/>
+        </w:rPr>
+        <w:t>.</w:t>
+      </w:r>
+    </w:p>
+    <w:p>
+      <w:pPr>
+        <w:spacing w:line="360" w:lineRule="auto"/>
+        <w:jc w:val="center"/>
+        <w:rPr>
+          <w:sz w:val="28"/>
+          <w:szCs w:val="28"/>
+        </w:rPr>
+      </w:pPr>
+      <w:r>
+        <w:rPr>
+          <w:sz w:val="28"/>
+          <w:szCs w:val="28"/>
+        </w:rPr>
+        <w:lastRenderedPageBreak/>
+        <w:drawing>
+          <wp:inline distT="0" distB="0" distL="0" distR="0" wp14:anchorId="1384F492" wp14:editId="6870CE16">
+            <wp:extent cx="2872033" cy="3941619"/>
+            <wp:effectExtent l="0" t="0" r="0" b="0"/>
+            <wp:docPr id="11" name="Рисунок 11"/>
+            <wp:cNvGraphicFramePr>
+              <a:graphicFrameLocks xmlns:a="http://schemas.openxmlformats.org/drawingml/2006/main" noChangeAspect="1"/>
+            </wp:cNvGraphicFramePr>
+            <a:graphic xmlns:a="http://schemas.openxmlformats.org/drawingml/2006/main">
+              <a:graphicData uri="http://schemas.openxmlformats.org/drawingml/2006/picture">
+                <pic:pic xmlns:pic="http://schemas.openxmlformats.org/drawingml/2006/picture">
+                  <pic:nvPicPr>
+                    <pic:cNvPr id="1" name=""/>
+                    <pic:cNvPicPr/>
+                  </pic:nvPicPr>
+                  <pic:blipFill>
+                    <a:blip r:embed="rId14"/>
+                    <a:stretch>
+                      <a:fillRect/>
+                    </a:stretch>
+                  </pic:blipFill>
+                  <pic:spPr>
+                    <a:xfrm>
+                      <a:off x="0" y="0"/>
+                      <a:ext cx="2882655" cy="3956197"/>
+                    </a:xfrm>
+                    <a:prstGeom prst="rect">
+                      <a:avLst/>
+                    </a:prstGeom>
+                  </pic:spPr>
+                </pic:pic>
+              </a:graphicData>
+            </a:graphic>
+          </wp:inline>
+        </w:drawing>
+      </w:r>
+    </w:p>
+    <w:p>
+      <w:pPr>
+        <w:spacing w:line="360" w:lineRule="auto"/>
+        <w:jc w:val="center"/>
+        <w:rPr>
+          <w:sz w:val="28"/>
+          <w:szCs w:val="28"/>
+          <w:lang w:val="en-US"/>
+        </w:rPr>
+      </w:pPr>
+      <w:r>
+        <w:rPr>
+          <w:sz w:val="28"/>
+          <w:szCs w:val="28"/>
+        </w:rPr>
+        <w:t xml:space="preserve">Рисунок </w:t>
+      </w:r>
+      <w:r>
+        <w:rPr>
+          <w:sz w:val="28"/>
+          <w:szCs w:val="28"/>
+        </w:rPr>
+        <w:t>9</w:t>
+      </w:r>
+      <w:r>
+        <w:rPr>
+          <w:sz w:val="28"/>
+          <w:szCs w:val="28"/>
+        </w:rPr>
+        <w:t xml:space="preserve">. Выполнение задания </w:t>
+      </w:r>
+      <w:r>
+        <w:rPr>
+          <w:sz w:val="28"/>
+          <w:szCs w:val="28"/>
+        </w:rPr>
+        <w:t>5</w:t>
+      </w:r>
+      <w:r>
+        <w:rPr>
+          <w:sz w:val="28"/>
+          <w:szCs w:val="28"/>
+        </w:rPr>
+        <w:t>.</w:t>
+      </w:r>
+    </w:p>
+    <w:p>
+      <w:pPr>
+        <w:spacing w:line="360" w:lineRule="auto"/>
+        <w:jc w:val="center"/>
+        <w:rPr>
+          <w:sz w:val="28"/>
+          <w:szCs w:val="28"/>
+        </w:rPr>
+      </w:pPr>
+    </w:p>
+    <w:p>
+      <w:pPr>
+        <w:spacing w:line="360" w:lineRule="auto"/>
+        <w:jc w:val="center"/>
+        <w:rPr>
+          <w:sz w:val="28"/>
+          <w:szCs w:val="28"/>
+        </w:rPr>
+      </w:pPr>
+      <w:r>
+        <w:rPr>
+          <w:sz w:val="28"/>
+          <w:szCs w:val="28"/>
+        </w:rPr>
+        <w:t>ЗАДАНИЕ 6 (вариант 14).</w:t>
       </w:r>
     </w:p>
     <w:p>
@@ -1681,7 +2795,38 @@
           <w:sz w:val="28"/>
           <w:szCs w:val="28"/>
         </w:rPr>
-        <w:t>Для выполнения данного задания было выполнено несколько примеров, которые продемонстрированы в методическом указании.</w:t>
+        <w:t>Построить кривую, заданную параметрически</w:t>
+      </w:r>
+      <w:r>
+        <w:rPr>
+          <w:sz w:val="28"/>
+          <w:szCs w:val="28"/>
+        </w:rPr>
+        <w:t xml:space="preserve">, </w:t>
+      </w:r>
+      <w:r>
+        <w:rPr>
+          <w:sz w:val="28"/>
+          <w:szCs w:val="28"/>
+        </w:rPr>
+        <w:t>а также касательную и нормаль к этой кривой в точке, соответствующей значению параметра t = t0.</w:t>
+      </w:r>
+    </w:p>
+    <w:p>
+      <w:pPr>
+        <w:spacing w:line="360" w:lineRule="auto"/>
+        <w:jc w:val="center"/>
+        <w:rPr>
+          <w:sz w:val="28"/>
+          <w:szCs w:val="28"/>
+        </w:rPr>
+      </w:pPr>
+      <w:r>
+        <w:rPr>
+          <w:sz w:val="28"/>
+          <w:szCs w:val="28"/>
+        </w:rPr>
+        <w:t>ВЫПОЛНЕНИЕ РАБОТЫ:</w:t>
       </w:r>
     </w:p>
     <w:p>
@@ -1694,22 +2839,166 @@
           <w:szCs w:val="28"/>
         </w:rPr>
       </w:pPr>
-    </w:p>
-    <w:p>
-      <w:pPr>
-        <w:spacing w:line="360" w:lineRule="auto"/>
-        <w:jc w:val="center"/>
-        <w:rPr>
-          <w:sz w:val="28"/>
-          <w:szCs w:val="28"/>
-        </w:rPr>
-      </w:pPr>
-      <w:r>
-        <w:rPr>
-          <w:sz w:val="28"/>
-          <w:szCs w:val="28"/>
-        </w:rPr>
-        <w:t>ЗАДАНИЕ 5 (вариант 14).</w:t>
+      <w:r>
+        <w:rPr>
+          <w:sz w:val="28"/>
+          <w:szCs w:val="28"/>
+        </w:rPr>
+        <w:t>Для выполнения данного задания был</w:t>
+      </w:r>
+      <w:r>
+        <w:rPr>
+          <w:sz w:val="28"/>
+          <w:szCs w:val="28"/>
+        </w:rPr>
+        <w:t>а построена кривая, заданная параметрически, а также касательная и нормаль к этой кривой</w:t>
+      </w:r>
+      <w:r>
+        <w:rPr>
+          <w:sz w:val="28"/>
+          <w:szCs w:val="28"/>
+        </w:rPr>
+        <w:t xml:space="preserve"> в точке </w:t>
+      </w:r>
+      <w:r>
+        <w:rPr>
+          <w:sz w:val="28"/>
+          <w:szCs w:val="28"/>
+          <w:lang w:val="en-US"/>
+        </w:rPr>
+        <w:t>t0</w:t>
+      </w:r>
+      <w:r>
+        <w:rPr>
+          <w:sz w:val="28"/>
+          <w:szCs w:val="28"/>
+        </w:rPr>
+        <w:t>.</w:t>
+      </w:r>
+    </w:p>
+    <w:p>
+      <w:pPr>
+        <w:spacing w:line="360" w:lineRule="auto"/>
+        <w:jc w:val="center"/>
+        <w:rPr>
+          <w:sz w:val="28"/>
+          <w:szCs w:val="28"/>
+        </w:rPr>
+      </w:pPr>
+      <w:r>
+        <w:rPr>
+          <w:sz w:val="28"/>
+          <w:szCs w:val="28"/>
+        </w:rPr>
+        <w:lastRenderedPageBreak/>
+        <w:drawing>
+          <wp:inline distT="0" distB="0" distL="0" distR="0" wp14:anchorId="0AA497C7" wp14:editId="50542116">
+            <wp:extent cx="2637759" cy="4287982"/>
+            <wp:effectExtent l="0" t="0" r="0" b="0"/>
+            <wp:docPr id="12" name="Рисунок 12"/>
+            <wp:cNvGraphicFramePr>
+              <a:graphicFrameLocks xmlns:a="http://schemas.openxmlformats.org/drawingml/2006/main" noChangeAspect="1"/>
+            </wp:cNvGraphicFramePr>
+            <a:graphic xmlns:a="http://schemas.openxmlformats.org/drawingml/2006/main">
+              <a:graphicData uri="http://schemas.openxmlformats.org/drawingml/2006/picture">
+                <pic:pic xmlns:pic="http://schemas.openxmlformats.org/drawingml/2006/picture">
+                  <pic:nvPicPr>
+                    <pic:cNvPr id="1" name=""/>
+                    <pic:cNvPicPr/>
+                  </pic:nvPicPr>
+                  <pic:blipFill>
+                    <a:blip r:embed="rId15"/>
+                    <a:stretch>
+                      <a:fillRect/>
+                    </a:stretch>
+                  </pic:blipFill>
+                  <pic:spPr>
+                    <a:xfrm>
+                      <a:off x="0" y="0"/>
+                      <a:ext cx="2644168" cy="4298401"/>
+                    </a:xfrm>
+                    <a:prstGeom prst="rect">
+                      <a:avLst/>
+                    </a:prstGeom>
+                  </pic:spPr>
+                </pic:pic>
+              </a:graphicData>
+            </a:graphic>
+          </wp:inline>
+        </w:drawing>
+      </w:r>
+    </w:p>
+    <w:p>
+      <w:pPr>
+        <w:spacing w:line="360" w:lineRule="auto"/>
+        <w:jc w:val="center"/>
+        <w:rPr>
+          <w:sz w:val="28"/>
+          <w:szCs w:val="28"/>
+          <w:lang w:val="en-US"/>
+        </w:rPr>
+      </w:pPr>
+      <w:r>
+        <w:rPr>
+          <w:sz w:val="28"/>
+          <w:szCs w:val="28"/>
+        </w:rPr>
+        <w:t xml:space="preserve">Рисунок </w:t>
+      </w:r>
+      <w:r>
+        <w:rPr>
+          <w:sz w:val="28"/>
+          <w:szCs w:val="28"/>
+        </w:rPr>
+        <w:t>10</w:t>
+      </w:r>
+      <w:r>
+        <w:rPr>
+          <w:sz w:val="28"/>
+          <w:szCs w:val="28"/>
+        </w:rPr>
+        <w:t xml:space="preserve">. Выполнение задания </w:t>
+      </w:r>
+      <w:r>
+        <w:rPr>
+          <w:sz w:val="28"/>
+          <w:szCs w:val="28"/>
+        </w:rPr>
+        <w:t>6</w:t>
+      </w:r>
+      <w:r>
+        <w:rPr>
+          <w:sz w:val="28"/>
+          <w:szCs w:val="28"/>
+        </w:rPr>
+        <w:t>.</w:t>
+      </w:r>
+    </w:p>
+    <w:p>
+      <w:pPr>
+        <w:spacing w:line="360" w:lineRule="auto"/>
+        <w:jc w:val="center"/>
+        <w:rPr>
+          <w:sz w:val="28"/>
+          <w:szCs w:val="28"/>
+        </w:rPr>
+      </w:pPr>
+    </w:p>
+    <w:p>
+      <w:pPr>
+        <w:spacing w:line="360" w:lineRule="auto"/>
+        <w:jc w:val="center"/>
+        <w:rPr>
+          <w:sz w:val="28"/>
+          <w:szCs w:val="28"/>
+        </w:rPr>
+      </w:pPr>
+      <w:r>
+        <w:rPr>
+          <w:sz w:val="28"/>
+          <w:szCs w:val="28"/>
+        </w:rPr>
+        <w:t>ЗАДАНИЕ 7 (вариант 14).</w:t>
       </w:r>
     </w:p>
     <w:p>
@@ -1727,7 +3016,14 @@
           <w:sz w:val="28"/>
           <w:szCs w:val="28"/>
         </w:rPr>
-        <w:t>Построить функцию y=f(x), а также касательную и нормаль к этой функции в точке с абсциссой a в соответствие с номером варианта.</w:t>
+        <w:t>Построить на плоскости разными цветами заданные плоские линии (отрезок прямой, эллипс, гипербола, парабола); вычислить и построить точки их пересечения</w:t>
+      </w:r>
+      <w:r>
+        <w:rPr>
+          <w:sz w:val="28"/>
+          <w:szCs w:val="28"/>
+        </w:rPr>
+        <w:t>.</w:t>
       </w:r>
     </w:p>
     <w:p>
@@ -1762,7 +3058,361 @@
           <w:sz w:val="28"/>
           <w:szCs w:val="28"/>
         </w:rPr>
-        <w:t>Для выполнения данного задания было выполнено несколько примеров, которые продемонстрированы в методическом указании.</w:t>
+        <w:t>Для выполнения данного задания был</w:t>
+      </w:r>
+      <w:r>
+        <w:rPr>
+          <w:sz w:val="28"/>
+          <w:szCs w:val="28"/>
+        </w:rPr>
+        <w:t>и построены плоские линии (отрезок прямой, эллипс, гипербола и парабола). А также вычислены и построены точки их пересечения.</w:t>
+      </w:r>
+    </w:p>
+    <w:p>
+      <w:pPr>
+        <w:spacing w:line="360" w:lineRule="auto"/>
+        <w:jc w:val="center"/>
+        <w:rPr>
+          <w:sz w:val="28"/>
+          <w:szCs w:val="28"/>
+        </w:rPr>
+      </w:pPr>
+      <w:r>
+        <w:rPr>
+          <w:sz w:val="28"/>
+          <w:szCs w:val="28"/>
+        </w:rPr>
+        <w:lastRenderedPageBreak/>
+        <w:drawing>
+          <wp:inline distT="0" distB="0" distL="0" distR="0" wp14:anchorId="5D9DEF20" wp14:editId="50C98BC9">
+            <wp:extent cx="4358889" cy="5334000"/>
+            <wp:effectExtent l="0" t="0" r="0" b="0"/>
+            <wp:docPr id="13" name="Рисунок 13"/>
+            <wp:cNvGraphicFramePr>
+              <a:graphicFrameLocks xmlns:a="http://schemas.openxmlformats.org/drawingml/2006/main" noChangeAspect="1"/>
+            </wp:cNvGraphicFramePr>
+            <a:graphic xmlns:a="http://schemas.openxmlformats.org/drawingml/2006/main">
+              <a:graphicData uri="http://schemas.openxmlformats.org/drawingml/2006/picture">
+                <pic:pic xmlns:pic="http://schemas.openxmlformats.org/drawingml/2006/picture">
+                  <pic:nvPicPr>
+                    <pic:cNvPr id="1" name=""/>
+                    <pic:cNvPicPr/>
+                  </pic:nvPicPr>
+                  <pic:blipFill>
+                    <a:blip r:embed="rId16"/>
+                    <a:stretch>
+                      <a:fillRect/>
+                    </a:stretch>
+                  </pic:blipFill>
+                  <pic:spPr>
+                    <a:xfrm>
+                      <a:off x="0" y="0"/>
+                      <a:ext cx="4374459" cy="5353053"/>
+                    </a:xfrm>
+                    <a:prstGeom prst="rect">
+                      <a:avLst/>
+                    </a:prstGeom>
+                  </pic:spPr>
+                </pic:pic>
+              </a:graphicData>
+            </a:graphic>
+          </wp:inline>
+        </w:drawing>
+      </w:r>
+    </w:p>
+    <w:p>
+      <w:pPr>
+        <w:spacing w:line="360" w:lineRule="auto"/>
+        <w:jc w:val="center"/>
+        <w:rPr>
+          <w:sz w:val="28"/>
+          <w:szCs w:val="28"/>
+          <w:lang w:val="en-US"/>
+        </w:rPr>
+      </w:pPr>
+      <w:r>
+        <w:rPr>
+          <w:sz w:val="28"/>
+          <w:szCs w:val="28"/>
+        </w:rPr>
+        <w:t>Рисунок 1</w:t>
+      </w:r>
+      <w:r>
+        <w:rPr>
+          <w:sz w:val="28"/>
+          <w:szCs w:val="28"/>
+        </w:rPr>
+        <w:t>1</w:t>
+      </w:r>
+      <w:r>
+        <w:rPr>
+          <w:sz w:val="28"/>
+          <w:szCs w:val="28"/>
+        </w:rPr>
+        <w:t xml:space="preserve">. Выполнение задания </w:t>
+      </w:r>
+      <w:r>
+        <w:rPr>
+          <w:sz w:val="28"/>
+          <w:szCs w:val="28"/>
+        </w:rPr>
+        <w:t>7</w:t>
+      </w:r>
+      <w:r>
+        <w:rPr>
+          <w:sz w:val="28"/>
+          <w:szCs w:val="28"/>
+        </w:rPr>
+        <w:t>.</w:t>
+      </w:r>
+      <w:r>
+        <w:rPr>
+          <w:sz w:val="28"/>
+          <w:szCs w:val="28"/>
+        </w:rPr>
+        <w:t xml:space="preserve"> Часть 1.</w:t>
+      </w:r>
+    </w:p>
+    <w:p>
+      <w:pPr>
+        <w:spacing w:line="360" w:lineRule="auto"/>
+        <w:jc w:val="center"/>
+        <w:rPr>
+          <w:sz w:val="28"/>
+          <w:szCs w:val="28"/>
+        </w:rPr>
+      </w:pPr>
+    </w:p>
+    <w:p>
+      <w:pPr>
+        <w:spacing w:line="360" w:lineRule="auto"/>
+        <w:jc w:val="center"/>
+        <w:rPr>
+          <w:sz w:val="28"/>
+          <w:szCs w:val="28"/>
+        </w:rPr>
+      </w:pPr>
+      <w:r>
+        <w:rPr>
+          <w:sz w:val="28"/>
+          <w:szCs w:val="28"/>
+        </w:rPr>
+        <w:drawing>
+          <wp:inline distT="0" distB="0" distL="0" distR="0" wp14:anchorId="6B9179D6" wp14:editId="2D1C9EB2">
+            <wp:extent cx="5940425" cy="2392680"/>
+            <wp:effectExtent l="0" t="0" r="0" b="0"/>
+            <wp:docPr id="14" name="Рисунок 14"/>
+            <wp:cNvGraphicFramePr>
+              <a:graphicFrameLocks xmlns:a="http://schemas.openxmlformats.org/drawingml/2006/main" noChangeAspect="1"/>
+            </wp:cNvGraphicFramePr>
+            <a:graphic xmlns:a="http://schemas.openxmlformats.org/drawingml/2006/main">
+              <a:graphicData uri="http://schemas.openxmlformats.org/drawingml/2006/picture">
+                <pic:pic xmlns:pic="http://schemas.openxmlformats.org/drawingml/2006/picture">
+                  <pic:nvPicPr>
+                    <pic:cNvPr id="1" name=""/>
+                    <pic:cNvPicPr/>
+                  </pic:nvPicPr>
+                  <pic:blipFill>
+                    <a:blip r:embed="rId17"/>
+                    <a:stretch>
+                      <a:fillRect/>
+                    </a:stretch>
+                  </pic:blipFill>
+                  <pic:spPr>
+                    <a:xfrm>
+                      <a:off x="0" y="0"/>
+                      <a:ext cx="5940425" cy="2392680"/>
+                    </a:xfrm>
+                    <a:prstGeom prst="rect">
+                      <a:avLst/>
+                    </a:prstGeom>
+                  </pic:spPr>
+                </pic:pic>
+              </a:graphicData>
+            </a:graphic>
+          </wp:inline>
+        </w:drawing>
+      </w:r>
+    </w:p>
+    <w:p>
+      <w:pPr>
+        <w:spacing w:line="360" w:lineRule="auto"/>
+        <w:jc w:val="center"/>
+        <w:rPr>
+          <w:sz w:val="28"/>
+          <w:szCs w:val="28"/>
+          <w:lang w:val="en-US"/>
+        </w:rPr>
+      </w:pPr>
+      <w:r>
+        <w:rPr>
+          <w:sz w:val="28"/>
+          <w:szCs w:val="28"/>
+        </w:rPr>
+        <w:t>Рисунок 1</w:t>
+      </w:r>
+      <w:r>
+        <w:rPr>
+          <w:sz w:val="28"/>
+          <w:szCs w:val="28"/>
+        </w:rPr>
+        <w:t>2</w:t>
+      </w:r>
+      <w:r>
+        <w:rPr>
+          <w:sz w:val="28"/>
+          <w:szCs w:val="28"/>
+        </w:rPr>
+        <w:t xml:space="preserve">. Выполнение задания 7. Часть </w:t>
+      </w:r>
+      <w:r>
+        <w:rPr>
+          <w:sz w:val="28"/>
+          <w:szCs w:val="28"/>
+        </w:rPr>
+        <w:t>2</w:t>
+      </w:r>
+      <w:r>
+        <w:rPr>
+          <w:sz w:val="28"/>
+          <w:szCs w:val="28"/>
+        </w:rPr>
+        <w:t>.</w:t>
+      </w:r>
+    </w:p>
+    <w:p>
+      <w:pPr>
+        <w:spacing w:line="360" w:lineRule="auto"/>
+        <w:jc w:val="center"/>
+        <w:rPr>
+          <w:sz w:val="28"/>
+          <w:szCs w:val="28"/>
+        </w:rPr>
+      </w:pPr>
+    </w:p>
+    <w:p>
+      <w:pPr>
+        <w:spacing w:line="360" w:lineRule="auto"/>
+        <w:jc w:val="center"/>
+        <w:rPr>
+          <w:sz w:val="28"/>
+          <w:szCs w:val="28"/>
+        </w:rPr>
+      </w:pPr>
+      <w:r>
+        <w:rPr>
+          <w:sz w:val="28"/>
+          <w:szCs w:val="28"/>
+        </w:rPr>
+        <w:lastRenderedPageBreak/>
+        <w:drawing>
+          <wp:inline distT="0" distB="0" distL="0" distR="0" wp14:anchorId="6A27E368" wp14:editId="4EBD33F6">
+            <wp:extent cx="3744353" cy="3557757"/>
+            <wp:effectExtent l="0" t="0" r="0" b="0"/>
+            <wp:docPr id="15" name="Рисунок 15"/>
+            <wp:cNvGraphicFramePr>
+              <a:graphicFrameLocks xmlns:a="http://schemas.openxmlformats.org/drawingml/2006/main" noChangeAspect="1"/>
+            </wp:cNvGraphicFramePr>
+            <a:graphic xmlns:a="http://schemas.openxmlformats.org/drawingml/2006/main">
+              <a:graphicData uri="http://schemas.openxmlformats.org/drawingml/2006/picture">
+                <pic:pic xmlns:pic="http://schemas.openxmlformats.org/drawingml/2006/picture">
+                  <pic:nvPicPr>
+                    <pic:cNvPr id="1" name=""/>
+                    <pic:cNvPicPr/>
+                  </pic:nvPicPr>
+                  <pic:blipFill>
+                    <a:blip r:embed="rId18"/>
+                    <a:stretch>
+                      <a:fillRect/>
+                    </a:stretch>
+                  </pic:blipFill>
+                  <pic:spPr>
+                    <a:xfrm>
+                      <a:off x="0" y="0"/>
+                      <a:ext cx="3751855" cy="3564885"/>
+                    </a:xfrm>
+                    <a:prstGeom prst="rect">
+                      <a:avLst/>
+                    </a:prstGeom>
+                  </pic:spPr>
+                </pic:pic>
+              </a:graphicData>
+            </a:graphic>
+          </wp:inline>
+        </w:drawing>
+      </w:r>
+    </w:p>
+    <w:p>
+      <w:pPr>
+        <w:spacing w:line="360" w:lineRule="auto"/>
+        <w:jc w:val="center"/>
+        <w:rPr>
+          <w:sz w:val="28"/>
+          <w:szCs w:val="28"/>
+          <w:lang w:val="en-US"/>
+        </w:rPr>
+      </w:pPr>
+      <w:r>
+        <w:rPr>
+          <w:sz w:val="28"/>
+          <w:szCs w:val="28"/>
+        </w:rPr>
+        <w:t>Рисунок 1</w:t>
+      </w:r>
+      <w:r>
+        <w:rPr>
+          <w:sz w:val="28"/>
+          <w:szCs w:val="28"/>
+        </w:rPr>
+        <w:t>3</w:t>
+      </w:r>
+      <w:r>
+        <w:rPr>
+          <w:sz w:val="28"/>
+          <w:szCs w:val="28"/>
+        </w:rPr>
+        <w:t xml:space="preserve">. Выполнение задания 7. Часть </w:t>
+      </w:r>
+      <w:r>
+        <w:rPr>
+          <w:sz w:val="28"/>
+          <w:szCs w:val="28"/>
+        </w:rPr>
+        <w:t>3</w:t>
+      </w:r>
+      <w:r>
+        <w:rPr>
+          <w:sz w:val="28"/>
+          <w:szCs w:val="28"/>
+        </w:rPr>
+        <w:t>.</w:t>
+      </w:r>
+    </w:p>
+    <w:p>
+      <w:pPr>
+        <w:spacing w:line="360" w:lineRule="auto"/>
+        <w:jc w:val="center"/>
+        <w:rPr>
+          <w:sz w:val="28"/>
+          <w:szCs w:val="28"/>
+        </w:rPr>
+      </w:pPr>
+    </w:p>
+    <w:p>
+      <w:pPr>
+        <w:spacing w:line="360" w:lineRule="auto"/>
+        <w:jc w:val="center"/>
+        <w:rPr>
+          <w:sz w:val="28"/>
+          <w:szCs w:val="28"/>
+        </w:rPr>
+      </w:pPr>
+      <w:r>
+        <w:rPr>
+          <w:sz w:val="28"/>
+          <w:szCs w:val="28"/>
+        </w:rPr>
+        <w:t>ЗАДАНИЕ 8 (вариант 14).</w:t>
       </w:r>
     </w:p>
     <w:p>
@@ -1775,22 +3425,43 @@
           <w:szCs w:val="28"/>
         </w:rPr>
       </w:pPr>
-    </w:p>
-    <w:p>
-      <w:pPr>
-        <w:spacing w:line="360" w:lineRule="auto"/>
-        <w:jc w:val="center"/>
-        <w:rPr>
-          <w:sz w:val="28"/>
-          <w:szCs w:val="28"/>
-        </w:rPr>
-      </w:pPr>
-      <w:r>
-        <w:rPr>
-          <w:sz w:val="28"/>
-          <w:szCs w:val="28"/>
-        </w:rPr>
-        <w:t>ЗАДАНИЕ 6 (вариант 14).</w:t>
+      <w:r>
+        <w:rPr>
+          <w:sz w:val="28"/>
+          <w:szCs w:val="28"/>
+        </w:rPr>
+        <w:t>Построить на плоскости разными цветами кривые</w:t>
+      </w:r>
+      <w:r>
+        <w:rPr>
+          <w:sz w:val="28"/>
+          <w:szCs w:val="28"/>
+        </w:rPr>
+        <w:t xml:space="preserve">, </w:t>
+      </w:r>
+      <w:r>
+        <w:rPr>
+          <w:sz w:val="28"/>
+          <w:szCs w:val="28"/>
+        </w:rPr>
+        <w:t>определить и построить все точки их пересечения. Параметры кривой 2 подобрать так, чтобы точек пересечения было не менее двух.</w:t>
+      </w:r>
+    </w:p>
+    <w:p>
+      <w:pPr>
+        <w:spacing w:line="360" w:lineRule="auto"/>
+        <w:jc w:val="center"/>
+        <w:rPr>
+          <w:sz w:val="28"/>
+          <w:szCs w:val="28"/>
+        </w:rPr>
+      </w:pPr>
+      <w:r>
+        <w:rPr>
+          <w:sz w:val="28"/>
+          <w:szCs w:val="28"/>
+        </w:rPr>
+        <w:t>ВЫПОЛНЕНИЕ РАБОТЫ:</w:t>
       </w:r>
     </w:p>
     <w:p>
@@ -1808,38 +3479,167 @@
           <w:sz w:val="28"/>
           <w:szCs w:val="28"/>
         </w:rPr>
-        <w:t>Построить кривую, заданную параметрически</w:t>
-      </w:r>
-      <w:r>
-        <w:rPr>
-          <w:sz w:val="28"/>
-          <w:szCs w:val="28"/>
-        </w:rPr>
-        <w:t xml:space="preserve">, </w:t>
-      </w:r>
-      <w:r>
-        <w:rPr>
-          <w:sz w:val="28"/>
-          <w:szCs w:val="28"/>
-        </w:rPr>
-        <w:t>а также касательную и нормаль к этой кривой в точке, соответствующей значению параметра t = t0.</w:t>
-      </w:r>
-    </w:p>
-    <w:p>
-      <w:pPr>
-        <w:spacing w:line="360" w:lineRule="auto"/>
-        <w:jc w:val="center"/>
-        <w:rPr>
-          <w:sz w:val="28"/>
-          <w:szCs w:val="28"/>
-        </w:rPr>
-      </w:pPr>
-      <w:r>
-        <w:rPr>
-          <w:sz w:val="28"/>
-          <w:szCs w:val="28"/>
-        </w:rPr>
-        <w:t>ВЫПОЛНЕНИЕ РАБОТЫ:</w:t>
+        <w:t xml:space="preserve">Для выполнения данного задания </w:t>
+      </w:r>
+      <w:r>
+        <w:rPr>
+          <w:sz w:val="28"/>
+          <w:szCs w:val="28"/>
+        </w:rPr>
+        <w:t xml:space="preserve">были построены кривые, а также определены и построены точки их пересечения. Параметры кривой 2 были подобраны так, чтобы </w:t>
+      </w:r>
+      <w:r>
+        <w:rPr>
+          <w:sz w:val="28"/>
+          <w:szCs w:val="28"/>
+        </w:rPr>
+        <w:t>точек пересе</w:t>
+      </w:r>
+      <w:r>
+        <w:rPr>
+          <w:sz w:val="28"/>
+          <w:szCs w:val="28"/>
+        </w:rPr>
+        <w:t>че</w:t>
+      </w:r>
+      <w:r>
+        <w:rPr>
+          <w:sz w:val="28"/>
+          <w:szCs w:val="28"/>
+        </w:rPr>
+        <w:t>ния было не менее двух.</w:t>
+      </w:r>
+    </w:p>
+    <w:p>
+      <w:pPr>
+        <w:spacing w:line="360" w:lineRule="auto"/>
+        <w:jc w:val="center"/>
+        <w:rPr>
+          <w:sz w:val="28"/>
+          <w:szCs w:val="28"/>
+        </w:rPr>
+      </w:pPr>
+      <w:r>
+        <w:rPr>
+          <w:sz w:val="28"/>
+          <w:szCs w:val="28"/>
+        </w:rPr>
+        <w:lastRenderedPageBreak/>
+        <w:drawing>
+          <wp:inline distT="0" distB="0" distL="0" distR="0" wp14:anchorId="32A8F385" wp14:editId="0BD67B50">
+            <wp:extent cx="2990850" cy="4156084"/>
+            <wp:effectExtent l="0" t="0" r="0" b="0"/>
+            <wp:docPr id="20" name="Рисунок 20"/>
+            <wp:cNvGraphicFramePr>
+              <a:graphicFrameLocks xmlns:a="http://schemas.openxmlformats.org/drawingml/2006/main" noChangeAspect="1"/>
+            </wp:cNvGraphicFramePr>
+            <a:graphic xmlns:a="http://schemas.openxmlformats.org/drawingml/2006/main">
+              <a:graphicData uri="http://schemas.openxmlformats.org/drawingml/2006/picture">
+                <pic:pic xmlns:pic="http://schemas.openxmlformats.org/drawingml/2006/picture">
+                  <pic:nvPicPr>
+                    <pic:cNvPr id="1" name=""/>
+                    <pic:cNvPicPr/>
+                  </pic:nvPicPr>
+                  <pic:blipFill rotWithShape="1">
+                    <a:blip r:embed="rId19"/>
+                    <a:srcRect t="1212"/>
+                    <a:stretch/>
+                  </pic:blipFill>
+                  <pic:spPr bwMode="auto">
+                    <a:xfrm>
+                      <a:off x="0" y="0"/>
+                      <a:ext cx="2996328" cy="4163696"/>
+                    </a:xfrm>
+                    <a:prstGeom prst="rect">
+                      <a:avLst/>
+                    </a:prstGeom>
+                    <a:ln>
+                      <a:noFill/>
+                    </a:ln>
+                    <a:extLst>
+                      <a:ext uri="{53640926-AAD7-44D8-BBD7-CCE9431645EC}">
+                        <a14:shadowObscured xmlns:a14="http://schemas.microsoft.com/office/drawing/2010/main"/>
+                      </a:ext>
+                    </a:extLst>
+                  </pic:spPr>
+                </pic:pic>
+              </a:graphicData>
+            </a:graphic>
+          </wp:inline>
+        </w:drawing>
+      </w:r>
+    </w:p>
+    <w:p>
+      <w:pPr>
+        <w:spacing w:line="360" w:lineRule="auto"/>
+        <w:jc w:val="center"/>
+        <w:rPr>
+          <w:sz w:val="28"/>
+          <w:szCs w:val="28"/>
+          <w:lang w:val="en-US"/>
+        </w:rPr>
+      </w:pPr>
+      <w:r>
+        <w:rPr>
+          <w:sz w:val="28"/>
+          <w:szCs w:val="28"/>
+        </w:rPr>
+        <w:t>Рисунок 1</w:t>
+      </w:r>
+      <w:r>
+        <w:rPr>
+          <w:sz w:val="28"/>
+          <w:szCs w:val="28"/>
+        </w:rPr>
+        <w:t>4</w:t>
+      </w:r>
+      <w:r>
+        <w:rPr>
+          <w:sz w:val="28"/>
+          <w:szCs w:val="28"/>
+        </w:rPr>
+        <w:t xml:space="preserve">. Выполнение задания </w:t>
+      </w:r>
+      <w:r>
+        <w:rPr>
+          <w:sz w:val="28"/>
+          <w:szCs w:val="28"/>
+        </w:rPr>
+        <w:t>8</w:t>
+      </w:r>
+      <w:r>
+        <w:rPr>
+          <w:sz w:val="28"/>
+          <w:szCs w:val="28"/>
+        </w:rPr>
+        <w:t>.</w:t>
+      </w:r>
+    </w:p>
+    <w:p>
+      <w:pPr>
+        <w:spacing w:line="360" w:lineRule="auto"/>
+        <w:jc w:val="center"/>
+        <w:rPr>
+          <w:sz w:val="28"/>
+          <w:szCs w:val="28"/>
+        </w:rPr>
+      </w:pPr>
+    </w:p>
+    <w:p>
+      <w:pPr>
+        <w:spacing w:line="360" w:lineRule="auto"/>
+        <w:jc w:val="center"/>
+        <w:rPr>
+          <w:sz w:val="28"/>
+          <w:szCs w:val="28"/>
+        </w:rPr>
+      </w:pPr>
+      <w:r>
+        <w:rPr>
+          <w:sz w:val="28"/>
+          <w:szCs w:val="28"/>
+        </w:rPr>
+        <w:t>ЗАДАНИЕ 9 (вариант 14).</w:t>
       </w:r>
     </w:p>
     <w:p>
@@ -1857,7 +3657,601 @@
           <w:sz w:val="28"/>
           <w:szCs w:val="28"/>
         </w:rPr>
-        <w:t>Для выполнения данного задания было выполнено несколько примеров, которые продемонстрированы в методическом указании.</w:t>
+        <w:t>Построить линию сопряжения двух плоских линий с заданными параметрами</w:t>
+      </w:r>
+      <w:r>
+        <w:rPr>
+          <w:sz w:val="28"/>
+          <w:szCs w:val="28"/>
+        </w:rPr>
+        <w:t>:</w:t>
+      </w:r>
+      <w:r>
+        <w:rPr>
+          <w:sz w:val="28"/>
+          <w:szCs w:val="28"/>
+        </w:rPr>
+        <w:t xml:space="preserve"> </w:t>
+      </w:r>
+    </w:p>
+    <w:p>
+      <w:pPr>
+        <w:spacing w:line="360" w:lineRule="auto"/>
+        <w:ind w:firstLine="708"/>
+        <w:jc w:val="both"/>
+        <w:rPr>
+          <w:sz w:val="28"/>
+          <w:szCs w:val="28"/>
+          <w:lang w:val="en-US"/>
+        </w:rPr>
+      </w:pPr>
+      <w:r>
+        <w:rPr>
+          <w:sz w:val="28"/>
+          <w:szCs w:val="28"/>
+          <w:lang w:val="en-US"/>
+        </w:rPr>
+        <w:t xml:space="preserve">- </w:t>
+      </w:r>
+      <w:r>
+        <w:rPr>
+          <w:sz w:val="28"/>
+          <w:szCs w:val="28"/>
+        </w:rPr>
+        <w:t>окружности A и отрезка прямой, проходящей через точку А</w:t>
+      </w:r>
+      <w:r>
+        <w:rPr>
+          <w:sz w:val="28"/>
+          <w:szCs w:val="28"/>
+          <w:lang w:val="en-US"/>
+        </w:rPr>
+        <w:t>;</w:t>
+      </w:r>
+    </w:p>
+    <w:p>
+      <w:pPr>
+        <w:spacing w:line="360" w:lineRule="auto"/>
+        <w:ind w:firstLine="708"/>
+        <w:jc w:val="both"/>
+        <w:rPr>
+          <w:sz w:val="28"/>
+          <w:szCs w:val="28"/>
+        </w:rPr>
+      </w:pPr>
+      <w:r>
+        <w:rPr>
+          <w:sz w:val="28"/>
+          <w:szCs w:val="28"/>
+        </w:rPr>
+        <w:t>- прямой, проходящей через точки A,</w:t>
+      </w:r>
+      <w:r>
+        <w:rPr>
+          <w:sz w:val="28"/>
+          <w:szCs w:val="28"/>
+          <w:lang w:val="en-US"/>
+        </w:rPr>
+        <w:t xml:space="preserve"> </w:t>
+      </w:r>
+      <w:r>
+        <w:rPr>
+          <w:sz w:val="28"/>
+          <w:szCs w:val="28"/>
+        </w:rPr>
+        <w:t>B и окружности A: радиус сопряжения R</w:t>
+      </w:r>
+      <w:r>
+        <w:rPr>
+          <w:sz w:val="28"/>
+          <w:szCs w:val="28"/>
+          <w:lang w:val="en-US"/>
+        </w:rPr>
+        <w:t>;</w:t>
+      </w:r>
+    </w:p>
+    <w:p>
+      <w:pPr>
+        <w:spacing w:line="360" w:lineRule="auto"/>
+        <w:jc w:val="center"/>
+        <w:rPr>
+          <w:sz w:val="28"/>
+          <w:szCs w:val="28"/>
+        </w:rPr>
+      </w:pPr>
+      <w:r>
+        <w:rPr>
+          <w:sz w:val="28"/>
+          <w:szCs w:val="28"/>
+        </w:rPr>
+        <w:t>ВЫПОЛНЕНИЕ РАБОТЫ:</w:t>
+      </w:r>
+    </w:p>
+    <w:p>
+      <w:pPr>
+        <w:spacing w:line="360" w:lineRule="auto"/>
+        <w:ind w:firstLine="708"/>
+        <w:jc w:val="both"/>
+        <w:rPr>
+          <w:sz w:val="28"/>
+          <w:szCs w:val="28"/>
+        </w:rPr>
+      </w:pPr>
+      <w:r>
+        <w:rPr>
+          <w:sz w:val="28"/>
+          <w:szCs w:val="28"/>
+        </w:rPr>
+        <w:t xml:space="preserve">Для выполнения данного задания </w:t>
+      </w:r>
+      <w:r>
+        <w:rPr>
+          <w:sz w:val="28"/>
+          <w:szCs w:val="28"/>
+        </w:rPr>
+        <w:t xml:space="preserve">была построена линия сопряжения двух плоских линий с параметрами: </w:t>
+      </w:r>
+      <w:r>
+        <w:rPr>
+          <w:sz w:val="28"/>
+          <w:szCs w:val="28"/>
+        </w:rPr>
+        <w:t>окружности A и отрезка прямой, проходящей через точку А</w:t>
+      </w:r>
+      <w:r>
+        <w:rPr>
+          <w:sz w:val="28"/>
+          <w:szCs w:val="28"/>
+        </w:rPr>
+        <w:t xml:space="preserve"> и </w:t>
+      </w:r>
+      <w:r>
+        <w:rPr>
+          <w:sz w:val="28"/>
+          <w:szCs w:val="28"/>
+        </w:rPr>
+        <w:t>прямой, проходящей через точки A,</w:t>
+      </w:r>
+      <w:r>
+        <w:rPr>
+          <w:sz w:val="28"/>
+          <w:szCs w:val="28"/>
+          <w:lang w:val="en-US"/>
+        </w:rPr>
+        <w:t xml:space="preserve"> </w:t>
+      </w:r>
+      <w:r>
+        <w:rPr>
+          <w:sz w:val="28"/>
+          <w:szCs w:val="28"/>
+        </w:rPr>
+        <w:t>B и окружности A: радиус сопряжения R</w:t>
+      </w:r>
+      <w:r>
+        <w:rPr>
+          <w:sz w:val="28"/>
+          <w:szCs w:val="28"/>
+        </w:rPr>
+        <w:t>.</w:t>
+      </w:r>
+    </w:p>
+    <w:p>
+      <w:pPr>
+        <w:spacing w:line="360" w:lineRule="auto"/>
+        <w:jc w:val="center"/>
+        <w:rPr>
+          <w:sz w:val="28"/>
+          <w:szCs w:val="28"/>
+        </w:rPr>
+      </w:pPr>
+      <w:r>
+        <w:rPr>
+          <w:sz w:val="28"/>
+          <w:szCs w:val="28"/>
+        </w:rPr>
+        <w:lastRenderedPageBreak/>
+        <w:drawing>
+          <wp:inline distT="0" distB="0" distL="0" distR="0" wp14:anchorId="07933EE2" wp14:editId="36E01D6C">
+            <wp:extent cx="5296517" cy="3473450"/>
+            <wp:effectExtent l="0" t="0" r="0" b="0"/>
+            <wp:docPr id="16" name="Рисунок 16"/>
+            <wp:cNvGraphicFramePr>
+              <a:graphicFrameLocks xmlns:a="http://schemas.openxmlformats.org/drawingml/2006/main" noChangeAspect="1"/>
+            </wp:cNvGraphicFramePr>
+            <a:graphic xmlns:a="http://schemas.openxmlformats.org/drawingml/2006/main">
+              <a:graphicData uri="http://schemas.openxmlformats.org/drawingml/2006/picture">
+                <pic:pic xmlns:pic="http://schemas.openxmlformats.org/drawingml/2006/picture">
+                  <pic:nvPicPr>
+                    <pic:cNvPr id="1" name=""/>
+                    <pic:cNvPicPr/>
+                  </pic:nvPicPr>
+                  <pic:blipFill>
+                    <a:blip r:embed="rId20"/>
+                    <a:stretch>
+                      <a:fillRect/>
+                    </a:stretch>
+                  </pic:blipFill>
+                  <pic:spPr>
+                    <a:xfrm>
+                      <a:off x="0" y="0"/>
+                      <a:ext cx="5314567" cy="3485287"/>
+                    </a:xfrm>
+                    <a:prstGeom prst="rect">
+                      <a:avLst/>
+                    </a:prstGeom>
+                  </pic:spPr>
+                </pic:pic>
+              </a:graphicData>
+            </a:graphic>
+          </wp:inline>
+        </w:drawing>
+      </w:r>
+    </w:p>
+    <w:p>
+      <w:pPr>
+        <w:spacing w:line="360" w:lineRule="auto"/>
+        <w:jc w:val="center"/>
+        <w:rPr>
+          <w:sz w:val="28"/>
+          <w:szCs w:val="28"/>
+          <w:lang w:val="en-US"/>
+        </w:rPr>
+      </w:pPr>
+      <w:r>
+        <w:rPr>
+          <w:sz w:val="28"/>
+          <w:szCs w:val="28"/>
+        </w:rPr>
+        <w:t>Рисунок 1</w:t>
+      </w:r>
+      <w:r>
+        <w:rPr>
+          <w:sz w:val="28"/>
+          <w:szCs w:val="28"/>
+        </w:rPr>
+        <w:t>5</w:t>
+      </w:r>
+      <w:r>
+        <w:rPr>
+          <w:sz w:val="28"/>
+          <w:szCs w:val="28"/>
+        </w:rPr>
+        <w:t xml:space="preserve">. Выполнение задания </w:t>
+      </w:r>
+      <w:r>
+        <w:rPr>
+          <w:sz w:val="28"/>
+          <w:szCs w:val="28"/>
+        </w:rPr>
+        <w:t>9</w:t>
+      </w:r>
+      <w:r>
+        <w:rPr>
+          <w:sz w:val="28"/>
+          <w:szCs w:val="28"/>
+        </w:rPr>
+        <w:t>. Часть 1.</w:t>
+      </w:r>
+    </w:p>
+    <w:p>
+      <w:pPr>
+        <w:spacing w:line="360" w:lineRule="auto"/>
+        <w:jc w:val="center"/>
+        <w:rPr>
+          <w:sz w:val="28"/>
+          <w:szCs w:val="28"/>
+        </w:rPr>
+      </w:pPr>
+    </w:p>
+    <w:p>
+      <w:pPr>
+        <w:spacing w:line="360" w:lineRule="auto"/>
+        <w:jc w:val="center"/>
+        <w:rPr>
+          <w:sz w:val="28"/>
+          <w:szCs w:val="28"/>
+        </w:rPr>
+      </w:pPr>
+      <w:r>
+        <w:rPr>
+          <w:sz w:val="28"/>
+          <w:szCs w:val="28"/>
+        </w:rPr>
+        <w:drawing>
+          <wp:inline distT="0" distB="0" distL="0" distR="0" wp14:anchorId="4ED59059" wp14:editId="720F978C">
+            <wp:extent cx="5940425" cy="3733165"/>
+            <wp:effectExtent l="0" t="0" r="0" b="0"/>
+            <wp:docPr id="17" name="Рисунок 17"/>
+            <wp:cNvGraphicFramePr>
+              <a:graphicFrameLocks xmlns:a="http://schemas.openxmlformats.org/drawingml/2006/main" noChangeAspect="1"/>
+            </wp:cNvGraphicFramePr>
+            <a:graphic xmlns:a="http://schemas.openxmlformats.org/drawingml/2006/main">
+              <a:graphicData uri="http://schemas.openxmlformats.org/drawingml/2006/picture">
+                <pic:pic xmlns:pic="http://schemas.openxmlformats.org/drawingml/2006/picture">
+                  <pic:nvPicPr>
+                    <pic:cNvPr id="1" name=""/>
+                    <pic:cNvPicPr/>
+                  </pic:nvPicPr>
+                  <pic:blipFill>
+                    <a:blip r:embed="rId21"/>
+                    <a:stretch>
+                      <a:fillRect/>
+                    </a:stretch>
+                  </pic:blipFill>
+                  <pic:spPr>
+                    <a:xfrm>
+                      <a:off x="0" y="0"/>
+                      <a:ext cx="5940425" cy="3733165"/>
+                    </a:xfrm>
+                    <a:prstGeom prst="rect">
+                      <a:avLst/>
+                    </a:prstGeom>
+                  </pic:spPr>
+                </pic:pic>
+              </a:graphicData>
+            </a:graphic>
+          </wp:inline>
+        </w:drawing>
+      </w:r>
+    </w:p>
+    <w:p>
+      <w:pPr>
+        <w:spacing w:line="360" w:lineRule="auto"/>
+        <w:jc w:val="center"/>
+        <w:rPr>
+          <w:sz w:val="28"/>
+          <w:szCs w:val="28"/>
+          <w:lang w:val="en-US"/>
+        </w:rPr>
+      </w:pPr>
+      <w:r>
+        <w:rPr>
+          <w:sz w:val="28"/>
+          <w:szCs w:val="28"/>
+        </w:rPr>
+        <w:t>Рисунок 1</w:t>
+      </w:r>
+      <w:r>
+        <w:rPr>
+          <w:sz w:val="28"/>
+          <w:szCs w:val="28"/>
+        </w:rPr>
+        <w:t>6</w:t>
+      </w:r>
+      <w:r>
+        <w:rPr>
+          <w:sz w:val="28"/>
+          <w:szCs w:val="28"/>
+        </w:rPr>
+        <w:t xml:space="preserve">. Выполнение задания </w:t>
+      </w:r>
+      <w:r>
+        <w:rPr>
+          <w:sz w:val="28"/>
+          <w:szCs w:val="28"/>
+        </w:rPr>
+        <w:t>9</w:t>
+      </w:r>
+      <w:r>
+        <w:rPr>
+          <w:sz w:val="28"/>
+          <w:szCs w:val="28"/>
+        </w:rPr>
+        <w:t>. Часть 2.</w:t>
+      </w:r>
+    </w:p>
+    <w:p>
+      <w:pPr>
+        <w:spacing w:line="360" w:lineRule="auto"/>
+        <w:jc w:val="center"/>
+        <w:rPr>
+          <w:sz w:val="28"/>
+          <w:szCs w:val="28"/>
+        </w:rPr>
+      </w:pPr>
+    </w:p>
+    <w:p>
+      <w:pPr>
+        <w:spacing w:line="360" w:lineRule="auto"/>
+        <w:jc w:val="center"/>
+        <w:rPr>
+          <w:sz w:val="28"/>
+          <w:szCs w:val="28"/>
+        </w:rPr>
+      </w:pPr>
+      <w:r>
+        <w:rPr>
+          <w:sz w:val="28"/>
+          <w:szCs w:val="28"/>
+        </w:rPr>
+        <w:lastRenderedPageBreak/>
+        <w:drawing>
+          <wp:inline distT="0" distB="0" distL="0" distR="0" wp14:anchorId="5B35C14E" wp14:editId="3845B975">
+            <wp:extent cx="5940425" cy="3437255"/>
+            <wp:effectExtent l="0" t="0" r="0" b="0"/>
+            <wp:docPr id="18" name="Рисунок 18"/>
+            <wp:cNvGraphicFramePr>
+              <a:graphicFrameLocks xmlns:a="http://schemas.openxmlformats.org/drawingml/2006/main" noChangeAspect="1"/>
+            </wp:cNvGraphicFramePr>
+            <a:graphic xmlns:a="http://schemas.openxmlformats.org/drawingml/2006/main">
+              <a:graphicData uri="http://schemas.openxmlformats.org/drawingml/2006/picture">
+                <pic:pic xmlns:pic="http://schemas.openxmlformats.org/drawingml/2006/picture">
+                  <pic:nvPicPr>
+                    <pic:cNvPr id="1" name=""/>
+                    <pic:cNvPicPr/>
+                  </pic:nvPicPr>
+                  <pic:blipFill>
+                    <a:blip r:embed="rId22"/>
+                    <a:stretch>
+                      <a:fillRect/>
+                    </a:stretch>
+                  </pic:blipFill>
+                  <pic:spPr>
+                    <a:xfrm>
+                      <a:off x="0" y="0"/>
+                      <a:ext cx="5940425" cy="3437255"/>
+                    </a:xfrm>
+                    <a:prstGeom prst="rect">
+                      <a:avLst/>
+                    </a:prstGeom>
+                  </pic:spPr>
+                </pic:pic>
+              </a:graphicData>
+            </a:graphic>
+          </wp:inline>
+        </w:drawing>
+      </w:r>
+    </w:p>
+    <w:p>
+      <w:pPr>
+        <w:spacing w:line="360" w:lineRule="auto"/>
+        <w:jc w:val="center"/>
+        <w:rPr>
+          <w:sz w:val="28"/>
+          <w:szCs w:val="28"/>
+          <w:lang w:val="en-US"/>
+        </w:rPr>
+      </w:pPr>
+      <w:r>
+        <w:rPr>
+          <w:sz w:val="28"/>
+          <w:szCs w:val="28"/>
+        </w:rPr>
+        <w:t>Рисунок 1</w:t>
+      </w:r>
+      <w:r>
+        <w:rPr>
+          <w:sz w:val="28"/>
+          <w:szCs w:val="28"/>
+        </w:rPr>
+        <w:t>7</w:t>
+      </w:r>
+      <w:r>
+        <w:rPr>
+          <w:sz w:val="28"/>
+          <w:szCs w:val="28"/>
+        </w:rPr>
+        <w:t xml:space="preserve">. Выполнение задания </w:t>
+      </w:r>
+      <w:r>
+        <w:rPr>
+          <w:sz w:val="28"/>
+          <w:szCs w:val="28"/>
+        </w:rPr>
+        <w:t>9</w:t>
+      </w:r>
+      <w:r>
+        <w:rPr>
+          <w:sz w:val="28"/>
+          <w:szCs w:val="28"/>
+        </w:rPr>
+        <w:t>. Часть 3.</w:t>
+      </w:r>
+    </w:p>
+    <w:p>
+      <w:pPr>
+        <w:spacing w:line="360" w:lineRule="auto"/>
+        <w:jc w:val="center"/>
+        <w:rPr>
+          <w:sz w:val="28"/>
+          <w:szCs w:val="28"/>
+        </w:rPr>
+      </w:pPr>
+    </w:p>
+    <w:p>
+      <w:pPr>
+        <w:spacing w:line="360" w:lineRule="auto"/>
+        <w:jc w:val="center"/>
+        <w:rPr>
+          <w:sz w:val="28"/>
+          <w:szCs w:val="28"/>
+        </w:rPr>
+      </w:pPr>
+      <w:r>
+        <w:rPr>
+          <w:sz w:val="28"/>
+          <w:szCs w:val="28"/>
+        </w:rPr>
+        <w:drawing>
+          <wp:inline distT="0" distB="0" distL="0" distR="0" wp14:anchorId="65E89B76" wp14:editId="27A0F588">
+            <wp:extent cx="5940425" cy="3489325"/>
+            <wp:effectExtent l="0" t="0" r="0" b="0"/>
+            <wp:docPr id="19" name="Рисунок 19"/>
+            <wp:cNvGraphicFramePr>
+              <a:graphicFrameLocks xmlns:a="http://schemas.openxmlformats.org/drawingml/2006/main" noChangeAspect="1"/>
+            </wp:cNvGraphicFramePr>
+            <a:graphic xmlns:a="http://schemas.openxmlformats.org/drawingml/2006/main">
+              <a:graphicData uri="http://schemas.openxmlformats.org/drawingml/2006/picture">
+                <pic:pic xmlns:pic="http://schemas.openxmlformats.org/drawingml/2006/picture">
+                  <pic:nvPicPr>
+                    <pic:cNvPr id="1" name=""/>
+                    <pic:cNvPicPr/>
+                  </pic:nvPicPr>
+                  <pic:blipFill>
+                    <a:blip r:embed="rId23"/>
+                    <a:stretch>
+                      <a:fillRect/>
+                    </a:stretch>
+                  </pic:blipFill>
+                  <pic:spPr>
+                    <a:xfrm>
+                      <a:off x="0" y="0"/>
+                      <a:ext cx="5940425" cy="3489325"/>
+                    </a:xfrm>
+                    <a:prstGeom prst="rect">
+                      <a:avLst/>
+                    </a:prstGeom>
+                  </pic:spPr>
+                </pic:pic>
+              </a:graphicData>
+            </a:graphic>
+          </wp:inline>
+        </w:drawing>
+      </w:r>
+    </w:p>
+    <w:p>
+      <w:pPr>
+        <w:spacing w:line="360" w:lineRule="auto"/>
+        <w:jc w:val="center"/>
+        <w:rPr>
+          <w:sz w:val="28"/>
+          <w:szCs w:val="28"/>
+        </w:rPr>
+      </w:pPr>
+      <w:r>
+        <w:rPr>
+          <w:sz w:val="28"/>
+          <w:szCs w:val="28"/>
+        </w:rPr>
+        <w:t>Рисунок 1</w:t>
+      </w:r>
+      <w:r>
+        <w:rPr>
+          <w:sz w:val="28"/>
+          <w:szCs w:val="28"/>
+        </w:rPr>
+        <w:t>8</w:t>
+      </w:r>
+      <w:r>
+        <w:rPr>
+          <w:sz w:val="28"/>
+          <w:szCs w:val="28"/>
+        </w:rPr>
+        <w:t xml:space="preserve">. Выполнение задания </w:t>
+      </w:r>
+      <w:r>
+        <w:rPr>
+          <w:sz w:val="28"/>
+          <w:szCs w:val="28"/>
+        </w:rPr>
+        <w:t>9</w:t>
+      </w:r>
+      <w:r>
+        <w:rPr>
+          <w:sz w:val="28"/>
+          <w:szCs w:val="28"/>
+        </w:rPr>
+        <w:t>. Часть 4.</w:t>
       </w:r>
     </w:p>
     <w:p>
@@ -1875,17 +4269,13 @@
       <w:pPr>
         <w:spacing w:line="360" w:lineRule="auto"/>
         <w:jc w:val="center"/>
-        <w:rPr>
-          <w:sz w:val="28"/>
-          <w:szCs w:val="28"/>
-        </w:rPr>
-      </w:pPr>
-      <w:r>
-        <w:rPr>
-          <w:sz w:val="28"/>
-          <w:szCs w:val="28"/>
-        </w:rPr>
-        <w:t>ЗАДАНИЕ 7 (вариант 14).</w:t>
+      </w:pPr>
+      <w:r>
+        <w:rPr>
+          <w:sz w:val="28"/>
+          <w:szCs w:val="28"/>
+        </w:rPr>
+        <w:t>ВЫВОД К РАБОТЕ:</w:t>
       </w:r>
     </w:p>
     <w:p>
@@ -1893,383 +4283,50 @@
         <w:spacing w:line="360" w:lineRule="auto"/>
         <w:ind w:firstLine="709"/>
         <w:jc w:val="both"/>
-        <w:rPr>
-          <w:sz w:val="28"/>
-          <w:szCs w:val="28"/>
-        </w:rPr>
-      </w:pPr>
-      <w:r>
-        <w:rPr>
-          <w:sz w:val="28"/>
-          <w:szCs w:val="28"/>
-        </w:rPr>
-        <w:lastRenderedPageBreak/>
-        <w:t>Построить на плоскости разными цветами заданные плоские линии (отрезок прямой, эллипс, гипербола, парабола); вычислить и построить точки их пересечения</w:t>
-      </w:r>
-      <w:r>
-        <w:rPr>
-          <w:sz w:val="28"/>
-          <w:szCs w:val="28"/>
+      </w:pPr>
+      <w:r>
+        <w:rPr>
+          <w:sz w:val="28"/>
+        </w:rPr>
+        <w:t>Я о</w:t>
+      </w:r>
+      <w:r>
+        <w:rPr>
+          <w:sz w:val="28"/>
+        </w:rPr>
+        <w:t>свои</w:t>
+      </w:r>
+      <w:r>
+        <w:rPr>
+          <w:sz w:val="28"/>
+        </w:rPr>
+        <w:t>л</w:t>
+      </w:r>
+      <w:r>
+        <w:rPr>
+          <w:sz w:val="28"/>
+        </w:rPr>
+        <w:t xml:space="preserve"> математическое моделирование кривых лини в плоскости в среде </w:t>
+      </w:r>
+      <w:proofErr w:type="spellStart"/>
+      <w:r>
+        <w:rPr>
+          <w:sz w:val="28"/>
+        </w:rPr>
+        <w:t>MathCAD</w:t>
+      </w:r>
+      <w:proofErr w:type="spellEnd"/>
+      <w:r>
+        <w:rPr>
+          <w:sz w:val="28"/>
         </w:rPr>
         <w:t>.</w:t>
       </w:r>
     </w:p>
-    <w:p>
-      <w:pPr>
-        <w:spacing w:line="360" w:lineRule="auto"/>
-        <w:jc w:val="center"/>
-        <w:rPr>
-          <w:sz w:val="28"/>
-          <w:szCs w:val="28"/>
-        </w:rPr>
-      </w:pPr>
-      <w:r>
-        <w:rPr>
-          <w:sz w:val="28"/>
-          <w:szCs w:val="28"/>
-        </w:rPr>
-        <w:t>ВЫПОЛНЕНИЕ РАБОТЫ:</w:t>
-      </w:r>
-    </w:p>
-    <w:p>
-      <w:pPr>
-        <w:spacing w:line="360" w:lineRule="auto"/>
-        <w:ind w:firstLine="709"/>
-        <w:jc w:val="both"/>
-        <w:rPr>
-          <w:sz w:val="28"/>
-          <w:szCs w:val="28"/>
-        </w:rPr>
-      </w:pPr>
-      <w:r>
-        <w:rPr>
-          <w:sz w:val="28"/>
-          <w:szCs w:val="28"/>
-        </w:rPr>
-        <w:t>Для выполнения данного задания было выполнено несколько примеров, которые продемонстрированы в методическом указании.</w:t>
-      </w:r>
-    </w:p>
-    <w:p>
-      <w:pPr>
-        <w:spacing w:line="360" w:lineRule="auto"/>
-        <w:ind w:firstLine="709"/>
-        <w:jc w:val="both"/>
-        <w:rPr>
-          <w:sz w:val="28"/>
-          <w:szCs w:val="28"/>
-        </w:rPr>
-      </w:pPr>
-    </w:p>
-    <w:p>
-      <w:pPr>
-        <w:spacing w:line="360" w:lineRule="auto"/>
-        <w:jc w:val="center"/>
-        <w:rPr>
-          <w:sz w:val="28"/>
-          <w:szCs w:val="28"/>
-        </w:rPr>
-      </w:pPr>
-      <w:r>
-        <w:rPr>
-          <w:sz w:val="28"/>
-          <w:szCs w:val="28"/>
-        </w:rPr>
-        <w:t>ЗАДАНИЕ 8 (вариант 14).</w:t>
-      </w:r>
-    </w:p>
-    <w:p>
-      <w:pPr>
-        <w:spacing w:line="360" w:lineRule="auto"/>
-        <w:ind w:firstLine="709"/>
-        <w:jc w:val="both"/>
-        <w:rPr>
-          <w:sz w:val="28"/>
-          <w:szCs w:val="28"/>
-        </w:rPr>
-      </w:pPr>
-      <w:r>
-        <w:rPr>
-          <w:sz w:val="28"/>
-          <w:szCs w:val="28"/>
-        </w:rPr>
-        <w:t>Построить на плоскости разными цветами кривые</w:t>
-      </w:r>
-      <w:r>
-        <w:rPr>
-          <w:sz w:val="28"/>
-          <w:szCs w:val="28"/>
-        </w:rPr>
-        <w:t xml:space="preserve">, </w:t>
-      </w:r>
-      <w:r>
-        <w:rPr>
-          <w:sz w:val="28"/>
-          <w:szCs w:val="28"/>
-        </w:rPr>
-        <w:t>определить и построить все точки их пересечения. Параметры кривой 2 подобрать так, чтобы точек пересечения было не менее двух.</w:t>
-      </w:r>
-    </w:p>
-    <w:p>
-      <w:pPr>
-        <w:spacing w:line="360" w:lineRule="auto"/>
-        <w:jc w:val="center"/>
-        <w:rPr>
-          <w:sz w:val="28"/>
-          <w:szCs w:val="28"/>
-        </w:rPr>
-      </w:pPr>
-      <w:r>
-        <w:rPr>
-          <w:sz w:val="28"/>
-          <w:szCs w:val="28"/>
-        </w:rPr>
-        <w:t>ВЫПОЛНЕНИЕ РАБОТЫ:</w:t>
-      </w:r>
-    </w:p>
-    <w:p>
-      <w:pPr>
-        <w:spacing w:line="360" w:lineRule="auto"/>
-        <w:ind w:firstLine="709"/>
-        <w:jc w:val="both"/>
-        <w:rPr>
-          <w:sz w:val="28"/>
-          <w:szCs w:val="28"/>
-        </w:rPr>
-      </w:pPr>
-      <w:r>
-        <w:rPr>
-          <w:sz w:val="28"/>
-          <w:szCs w:val="28"/>
-        </w:rPr>
-        <w:t>Для выполнения данного задания было выполнено несколько примеров, которые продемонстрированы в методическом указании.</w:t>
-      </w:r>
-    </w:p>
-    <w:p>
-      <w:pPr>
-        <w:spacing w:line="360" w:lineRule="auto"/>
-        <w:ind w:firstLine="709"/>
-        <w:jc w:val="both"/>
-        <w:rPr>
-          <w:sz w:val="28"/>
-          <w:szCs w:val="28"/>
-        </w:rPr>
-      </w:pPr>
-    </w:p>
-    <w:p>
-      <w:pPr>
-        <w:spacing w:line="360" w:lineRule="auto"/>
-        <w:jc w:val="center"/>
-        <w:rPr>
-          <w:sz w:val="28"/>
-          <w:szCs w:val="28"/>
-        </w:rPr>
-      </w:pPr>
-      <w:r>
-        <w:rPr>
-          <w:sz w:val="28"/>
-          <w:szCs w:val="28"/>
-        </w:rPr>
-        <w:t>ЗАДАНИЕ 9 (вариант 14).</w:t>
-      </w:r>
-    </w:p>
-    <w:p>
-      <w:pPr>
-        <w:spacing w:line="360" w:lineRule="auto"/>
-        <w:ind w:firstLine="709"/>
-        <w:jc w:val="both"/>
-        <w:rPr>
-          <w:sz w:val="28"/>
-          <w:szCs w:val="28"/>
-        </w:rPr>
-      </w:pPr>
-      <w:r>
-        <w:rPr>
-          <w:sz w:val="28"/>
-          <w:szCs w:val="28"/>
-        </w:rPr>
-        <w:t>Построить линию сопряжения двух плоских линий с заданными параметрами</w:t>
-      </w:r>
-      <w:r>
-        <w:rPr>
-          <w:sz w:val="28"/>
-          <w:szCs w:val="28"/>
-        </w:rPr>
-        <w:t>:</w:t>
-      </w:r>
-      <w:r>
-        <w:rPr>
-          <w:sz w:val="28"/>
-          <w:szCs w:val="28"/>
-        </w:rPr>
-        <w:t xml:space="preserve"> </w:t>
-      </w:r>
-    </w:p>
-    <w:p>
-      <w:pPr>
-        <w:spacing w:line="360" w:lineRule="auto"/>
-        <w:ind w:firstLine="708"/>
-        <w:jc w:val="both"/>
-        <w:rPr>
-          <w:sz w:val="28"/>
-          <w:szCs w:val="28"/>
-          <w:lang w:val="en-US"/>
-        </w:rPr>
-      </w:pPr>
-      <w:r>
-        <w:rPr>
-          <w:sz w:val="28"/>
-          <w:szCs w:val="28"/>
-          <w:lang w:val="en-US"/>
-        </w:rPr>
-        <w:t xml:space="preserve">- </w:t>
-      </w:r>
-      <w:r>
-        <w:rPr>
-          <w:sz w:val="28"/>
-          <w:szCs w:val="28"/>
-        </w:rPr>
-        <w:t>окружности A и отрезка прямой, проходящей через точку А</w:t>
-      </w:r>
-      <w:r>
-        <w:rPr>
-          <w:sz w:val="28"/>
-          <w:szCs w:val="28"/>
-          <w:lang w:val="en-US"/>
-        </w:rPr>
-        <w:t>;</w:t>
-      </w:r>
-    </w:p>
-    <w:p>
-      <w:pPr>
-        <w:spacing w:line="360" w:lineRule="auto"/>
-        <w:ind w:firstLine="708"/>
-        <w:jc w:val="both"/>
-        <w:rPr>
-          <w:sz w:val="28"/>
-          <w:szCs w:val="28"/>
-        </w:rPr>
-      </w:pPr>
-      <w:r>
-        <w:rPr>
-          <w:sz w:val="28"/>
-          <w:szCs w:val="28"/>
-        </w:rPr>
-        <w:t>- прямой, проходящей через точки A,</w:t>
-      </w:r>
-      <w:r>
-        <w:rPr>
-          <w:sz w:val="28"/>
-          <w:szCs w:val="28"/>
-          <w:lang w:val="en-US"/>
-        </w:rPr>
-        <w:t xml:space="preserve"> </w:t>
-      </w:r>
-      <w:r>
-        <w:rPr>
-          <w:sz w:val="28"/>
-          <w:szCs w:val="28"/>
-        </w:rPr>
-        <w:t>B и окружности A: радиус сопряжения R</w:t>
-      </w:r>
-      <w:r>
-        <w:rPr>
-          <w:sz w:val="28"/>
-          <w:szCs w:val="28"/>
-          <w:lang w:val="en-US"/>
-        </w:rPr>
-        <w:t>;</w:t>
-      </w:r>
-    </w:p>
-    <w:p>
-      <w:pPr>
-        <w:spacing w:line="360" w:lineRule="auto"/>
-        <w:jc w:val="center"/>
-        <w:rPr>
-          <w:sz w:val="28"/>
-          <w:szCs w:val="28"/>
-        </w:rPr>
-      </w:pPr>
-      <w:r>
-        <w:rPr>
-          <w:sz w:val="28"/>
-          <w:szCs w:val="28"/>
-        </w:rPr>
-        <w:t>ВЫПОЛНЕНИЕ РАБОТЫ:</w:t>
-      </w:r>
-    </w:p>
-    <w:p>
-      <w:pPr>
-        <w:spacing w:line="360" w:lineRule="auto"/>
-        <w:ind w:firstLine="709"/>
-        <w:jc w:val="both"/>
-        <w:rPr>
-          <w:sz w:val="28"/>
-          <w:szCs w:val="28"/>
-        </w:rPr>
-      </w:pPr>
-      <w:r>
-        <w:rPr>
-          <w:sz w:val="28"/>
-          <w:szCs w:val="28"/>
-        </w:rPr>
-        <w:t>Для выполнения данного задания было выполнено несколько примеров, которые продемонстрированы в методическом указании.</w:t>
-      </w:r>
-    </w:p>
-    <w:p>
-      <w:pPr>
-        <w:spacing w:line="360" w:lineRule="auto"/>
-        <w:ind w:firstLine="709"/>
-        <w:jc w:val="both"/>
-        <w:rPr>
-          <w:sz w:val="28"/>
-          <w:szCs w:val="28"/>
-        </w:rPr>
-      </w:pPr>
-    </w:p>
-    <w:p>
-      <w:pPr>
-        <w:spacing w:line="360" w:lineRule="auto"/>
-        <w:jc w:val="center"/>
-      </w:pPr>
-      <w:r>
-        <w:rPr>
-          <w:sz w:val="28"/>
-          <w:szCs w:val="28"/>
-        </w:rPr>
-        <w:t>ВЫВОД К РАБОТЕ:</w:t>
-      </w:r>
-    </w:p>
-    <w:p>
-      <w:pPr>
-        <w:spacing w:line="360" w:lineRule="auto"/>
-        <w:ind w:firstLine="709"/>
-        <w:jc w:val="both"/>
-      </w:pPr>
-      <w:r>
-        <w:rPr>
-          <w:sz w:val="28"/>
-        </w:rPr>
-        <w:t xml:space="preserve">Я освоил математическое моделирование взаимного положения простых объектов в пространстве в среде </w:t>
-      </w:r>
-      <w:proofErr w:type="spellStart"/>
-      <w:r>
-        <w:rPr>
-          <w:sz w:val="28"/>
-        </w:rPr>
-        <w:t>MathCAD</w:t>
-      </w:r>
-      <w:proofErr w:type="spellEnd"/>
-      <w:r>
-        <w:rPr>
-          <w:sz w:val="28"/>
-        </w:rPr>
-        <w:t>.</w:t>
-      </w:r>
-    </w:p>
     <w:sectPr>
-      <w:footerReference w:type="even" r:id="rId6"/>
-      <w:footerReference w:type="default" r:id="rId7"/>
-      <w:footerReference w:type="first" r:id="rId8"/>
+      <w:footerReference w:type="even" r:id="rId24"/>
+      <w:footerReference w:type="default" r:id="rId25"/>
+      <w:footerReference w:type="first" r:id="rId26"/>
       <w:pgSz w:w="11906" w:h="16838"/>
       <w:pgMar w:top="1134" w:right="850" w:bottom="1134" w:left="1701" w:header="0" w:footer="708" w:gutter="0"/>
       <w:cols w:space="720"/>
@@ -2779,7 +4836,7 @@
   <w:style w:type="paragraph" w:default="1" w:styleId="a">
     <w:name w:val="Normal"/>
     <w:qFormat/>
-    <w:rsid w:val="001F328D"/>
+    <w:rsid w:val="00A35746"/>
     <w:pPr>
       <w:widowControl w:val="0"/>
     </w:pPr>
@@ -2814,6 +4871,7 @@
   <w:style w:type="character" w:default="1" w:styleId="a0">
     <w:name w:val="Default Paragraph Font"/>
     <w:uiPriority w:val="1"/>
+    <w:semiHidden/>
     <w:unhideWhenUsed/>
   </w:style>
   <w:style w:type="table" w:default="1" w:styleId="a1">

</xml_diff>